<commit_message>
Simulationstool nach der Prüfung X3 korrigiert, Tests erweitert, Hinweise präzisiert, Protokolle Version 13, Übergabe
Co-Authored-By: Claude Opus 5.5 <noreply@anthropic.com>
Claude-Session: https://claude.ai/code/session_01H6HhHh1SmuARGHNzYGswr7
</commit_message>
<xml_diff>
--- a/ergebnisse/kaffee/fertig/Aufgabensammlung_Tutorien_WUE_2026-10-31.docx
+++ b/ergebnisse/kaffee/fertig/Aufgabensammlung_Tutorien_WUE_2026-10-31.docx
@@ -484,6 +484,9 @@
                 </m:e>
                 <m:sub>
                   <m:r>
+                    <m:rPr>
+                      <m:sty m:val="p"/>
+                    </m:rPr>
                     <m:t>i</m:t>
                   </m:r>
                 </m:sub>
@@ -507,6 +510,9 @@
                 </m:e>
                 <m:sub>
                   <m:r>
+                    <m:rPr>
+                      <m:sty m:val="p"/>
+                    </m:rPr>
                     <m:t>a</m:t>
                   </m:r>
                 </m:sub>
@@ -11300,9 +11306,15 @@
           </m:e>
           <m:sub>
             <m:r>
+              <m:rPr>
+                <m:sty m:val="p"/>
+              </m:rPr>
               <m:t>t</m:t>
             </m:r>
             <m:r>
+              <m:rPr>
+                <m:sty m:val="p"/>
+              </m:rPr>
               <m:t>h</m:t>
             </m:r>
           </m:sub>
@@ -11420,6 +11432,9 @@
           </m:e>
           <m:sub>
             <m:r>
+              <m:rPr>
+                <m:sty m:val="p"/>
+              </m:rPr>
               <m:t>a</m:t>
             </m:r>
           </m:sub>
@@ -11568,6 +11583,9 @@
                 </m:e>
                 <m:sub>
                   <m:r>
+                    <m:rPr>
+                      <m:sty m:val="p"/>
+                    </m:rPr>
                     <m:t>u</m:t>
                   </m:r>
                 </m:sub>
@@ -11635,6 +11653,9 @@
                 </m:e>
                 <m:sub>
                   <m:r>
+                    <m:rPr>
+                      <m:sty m:val="p"/>
+                    </m:rPr>
                     <m:t>W</m:t>
                   </m:r>
                 </m:sub>
@@ -11716,6 +11737,9 @@
                 </m:e>
                 <m:sub>
                   <m:r>
+                    <m:rPr>
+                      <m:sty m:val="p"/>
+                    </m:rPr>
                     <m:t>a</m:t>
                   </m:r>
                 </m:sub>
@@ -11942,6 +11966,9 @@
                 </m:e>
                 <m:sub>
                   <m:r>
+                    <m:rPr>
+                      <m:sty m:val="p"/>
+                    </m:rPr>
                     <m:t>S</m:t>
                   </m:r>
                 </m:sub>
@@ -12006,6 +12033,9 @@
                 </m:e>
                 <m:sub>
                   <m:r>
+                    <m:rPr>
+                      <m:sty m:val="p"/>
+                    </m:rPr>
                     <m:t>E</m:t>
                   </m:r>
                 </m:sub>
@@ -12075,6 +12105,9 @@
                 </m:e>
                 <m:sub>
                   <m:r>
+                    <m:rPr>
+                      <m:sty m:val="p"/>
+                    </m:rPr>
                     <m:t>S</m:t>
                   </m:r>
                 </m:sub>
@@ -12173,6 +12206,9 @@
                 </m:e>
                 <m:sub>
                   <m:r>
+                    <m:rPr>
+                      <m:sty m:val="p"/>
+                    </m:rPr>
                     <m:t>E</m:t>
                   </m:r>
                 </m:sub>
@@ -12294,6 +12330,9 @@
                 </m:e>
                 <m:sub>
                   <m:r>
+                    <m:rPr>
+                      <m:sty m:val="p"/>
+                    </m:rPr>
                     <m:t>E</m:t>
                   </m:r>
                 </m:sub>
@@ -12405,15 +12444,27 @@
                 </m:e>
                 <m:sub>
                   <m:r>
+                    <m:rPr>
+                      <m:sty m:val="p"/>
+                    </m:rPr>
                     <m:t>s</m:t>
                   </m:r>
                   <m:r>
+                    <m:rPr>
+                      <m:sty m:val="p"/>
+                    </m:rPr>
                     <m:t>c</m:t>
                   </m:r>
                   <m:r>
+                    <m:rPr>
+                      <m:sty m:val="p"/>
+                    </m:rPr>
                     <m:t>h</m:t>
                   </m:r>
                   <m:r>
+                    <m:rPr>
+                      <m:sty m:val="p"/>
+                    </m:rPr>
                     <m:t>m</m:t>
                   </m:r>
                 </m:sub>
@@ -12663,6 +12714,9 @@
                 </m:e>
                 <m:sub>
                   <m:r>
+                    <m:rPr>
+                      <m:sty m:val="p"/>
+                    </m:rPr>
                     <m:t>J</m:t>
                   </m:r>
                 </m:sub>
@@ -12734,6 +12788,9 @@
           </m:e>
           <m:sub>
             <m:r>
+              <m:rPr>
+                <m:sty m:val="p"/>
+              </m:rPr>
               <m:t>W</m:t>
             </m:r>
           </m:sub>
@@ -12776,9 +12833,15 @@
           </m:e>
           <m:sub>
             <m:r>
+              <m:rPr>
+                <m:sty m:val="p"/>
+              </m:rPr>
               <m:t>t</m:t>
             </m:r>
             <m:r>
+              <m:rPr>
+                <m:sty m:val="p"/>
+              </m:rPr>
               <m:t>h</m:t>
             </m:r>
             <m:r>
@@ -12808,9 +12871,15 @@
           </m:e>
           <m:sub>
             <m:r>
+              <m:rPr>
+                <m:sty m:val="p"/>
+              </m:rPr>
               <m:t>t</m:t>
             </m:r>
             <m:r>
+              <m:rPr>
+                <m:sty m:val="p"/>
+              </m:rPr>
               <m:t>h</m:t>
             </m:r>
             <m:r>
@@ -12820,6 +12889,9 @@
               <m:t>,</m:t>
             </m:r>
             <m:r>
+              <m:rPr>
+                <m:sty m:val="p"/>
+              </m:rPr>
               <m:t>S</m:t>
             </m:r>
           </m:sub>
@@ -12843,9 +12915,15 @@
           </m:e>
           <m:sub>
             <m:r>
+              <m:rPr>
+                <m:sty m:val="p"/>
+              </m:rPr>
               <m:t>t</m:t>
             </m:r>
             <m:r>
+              <m:rPr>
+                <m:sty m:val="p"/>
+              </m:rPr>
               <m:t>h</m:t>
             </m:r>
             <m:r>
@@ -12855,6 +12933,9 @@
               <m:t>,</m:t>
             </m:r>
             <m:r>
+              <m:rPr>
+                <m:sty m:val="p"/>
+              </m:rPr>
               <m:t>E</m:t>
             </m:r>
           </m:sub>
@@ -12875,6 +12956,9 @@
           </m:e>
           <m:sub>
             <m:r>
+              <m:rPr>
+                <m:sty m:val="p"/>
+              </m:rPr>
               <m:t>S</m:t>
             </m:r>
           </m:sub>
@@ -12984,9 +13068,15 @@
           </m:e>
           <m:sub>
             <m:r>
+              <m:rPr>
+                <m:sty m:val="p"/>
+              </m:rPr>
               <m:t>t</m:t>
             </m:r>
             <m:r>
+              <m:rPr>
+                <m:sty m:val="p"/>
+              </m:rPr>
               <m:t>h</m:t>
             </m:r>
             <m:r>
@@ -12996,6 +13086,9 @@
               <m:t>,</m:t>
             </m:r>
             <m:r>
+              <m:rPr>
+                <m:sty m:val="p"/>
+              </m:rPr>
               <m:t>S</m:t>
             </m:r>
           </m:sub>
@@ -13016,9 +13109,15 @@
           </m:e>
           <m:sub>
             <m:r>
+              <m:rPr>
+                <m:sty m:val="p"/>
+              </m:rPr>
               <m:t>t</m:t>
             </m:r>
             <m:r>
+              <m:rPr>
+                <m:sty m:val="p"/>
+              </m:rPr>
               <m:t>h</m:t>
             </m:r>
             <m:r>
@@ -13090,9 +13189,15 @@
           </m:e>
           <m:sub>
             <m:r>
+              <m:rPr>
+                <m:sty m:val="p"/>
+              </m:rPr>
               <m:t>t</m:t>
             </m:r>
             <m:r>
+              <m:rPr>
+                <m:sty m:val="p"/>
+              </m:rPr>
               <m:t>h</m:t>
             </m:r>
             <m:r>
@@ -13102,6 +13207,9 @@
               <m:t>,</m:t>
             </m:r>
             <m:r>
+              <m:rPr>
+                <m:sty m:val="p"/>
+              </m:rPr>
               <m:t>S</m:t>
             </m:r>
           </m:sub>
@@ -13164,9 +13272,15 @@
           </m:e>
           <m:sub>
             <m:r>
+              <m:rPr>
+                <m:sty m:val="p"/>
+              </m:rPr>
               <m:t>t</m:t>
             </m:r>
             <m:r>
+              <m:rPr>
+                <m:sty m:val="p"/>
+              </m:rPr>
               <m:t>h</m:t>
             </m:r>
             <m:r>
@@ -13176,6 +13290,9 @@
               <m:t>,</m:t>
             </m:r>
             <m:r>
+              <m:rPr>
+                <m:sty m:val="p"/>
+              </m:rPr>
               <m:t>E</m:t>
             </m:r>
           </m:sub>
@@ -13238,9 +13355,15 @@
           </m:e>
           <m:sub>
             <m:r>
+              <m:rPr>
+                <m:sty m:val="p"/>
+              </m:rPr>
               <m:t>t</m:t>
             </m:r>
             <m:r>
+              <m:rPr>
+                <m:sty m:val="p"/>
+              </m:rPr>
               <m:t>h</m:t>
             </m:r>
             <m:r>
@@ -13250,6 +13373,9 @@
               <m:t>,</m:t>
             </m:r>
             <m:r>
+              <m:rPr>
+                <m:sty m:val="p"/>
+              </m:rPr>
               <m:t>S</m:t>
             </m:r>
           </m:sub>
@@ -13340,9 +13466,15 @@
           </m:e>
           <m:sub>
             <m:r>
+              <m:rPr>
+                <m:sty m:val="p"/>
+              </m:rPr>
               <m:t>t</m:t>
             </m:r>
             <m:r>
+              <m:rPr>
+                <m:sty m:val="p"/>
+              </m:rPr>
               <m:t>h</m:t>
             </m:r>
             <m:r>
@@ -13352,12 +13484,21 @@
               <m:t>,</m:t>
             </m:r>
             <m:r>
+              <m:rPr>
+                <m:sty m:val="p"/>
+              </m:rPr>
               <m:t>g</m:t>
             </m:r>
             <m:r>
+              <m:rPr>
+                <m:sty m:val="p"/>
+              </m:rPr>
               <m:t>e</m:t>
             </m:r>
             <m:r>
+              <m:rPr>
+                <m:sty m:val="p"/>
+              </m:rPr>
               <m:t>s</m:t>
             </m:r>
           </m:sub>
@@ -13413,6 +13554,9 @@
           </m:e>
           <m:sub>
             <m:r>
+              <m:rPr>
+                <m:sty m:val="p"/>
+              </m:rPr>
               <m:t>O</m:t>
             </m:r>
           </m:sub>
@@ -13436,9 +13580,15 @@
           </m:e>
           <m:sub>
             <m:r>
+              <m:rPr>
+                <m:sty m:val="p"/>
+              </m:rPr>
               <m:t>S</m:t>
             </m:r>
             <m:r>
+              <m:rPr>
+                <m:sty m:val="p"/>
+              </m:rPr>
               <m:t>E</m:t>
             </m:r>
           </m:sub>
@@ -13462,9 +13612,15 @@
           </m:e>
           <m:sub>
             <m:r>
+              <m:rPr>
+                <m:sty m:val="p"/>
+              </m:rPr>
               <m:t>t</m:t>
             </m:r>
             <m:r>
+              <m:rPr>
+                <m:sty m:val="p"/>
+              </m:rPr>
               <m:t>h</m:t>
             </m:r>
             <m:r>
@@ -13474,12 +13630,21 @@
               <m:t>,</m:t>
             </m:r>
             <m:r>
+              <m:rPr>
+                <m:sty m:val="p"/>
+              </m:rPr>
               <m:t>g</m:t>
             </m:r>
             <m:r>
+              <m:rPr>
+                <m:sty m:val="p"/>
+              </m:rPr>
               <m:t>e</m:t>
             </m:r>
             <m:r>
+              <m:rPr>
+                <m:sty m:val="p"/>
+              </m:rPr>
               <m:t>s</m:t>
             </m:r>
           </m:sub>
@@ -13640,6 +13805,9 @@
           </m:e>
           <m:sub>
             <m:r>
+              <m:rPr>
+                <m:sty m:val="p"/>
+              </m:rPr>
               <m:t>O</m:t>
             </m:r>
           </m:sub>
@@ -13702,9 +13870,15 @@
           </m:e>
           <m:sub>
             <m:r>
+              <m:rPr>
+                <m:sty m:val="p"/>
+              </m:rPr>
               <m:t>S</m:t>
             </m:r>
             <m:r>
+              <m:rPr>
+                <m:sty m:val="p"/>
+              </m:rPr>
               <m:t>E</m:t>
             </m:r>
           </m:sub>
@@ -13779,6 +13953,9 @@
           </m:e>
           <m:sub>
             <m:r>
+              <m:rPr>
+                <m:sty m:val="p"/>
+              </m:rPr>
               <m:t>W</m:t>
             </m:r>
           </m:sub>
@@ -13802,6 +13979,9 @@
           </m:e>
           <m:sub>
             <m:r>
+              <m:rPr>
+                <m:sty m:val="p"/>
+              </m:rPr>
               <m:t>a</m:t>
             </m:r>
           </m:sub>
@@ -14016,6 +14196,9 @@
           </m:e>
           <m:sub>
             <m:r>
+              <m:rPr>
+                <m:sty m:val="p"/>
+              </m:rPr>
               <m:t>S</m:t>
             </m:r>
           </m:sub>
@@ -14186,6 +14369,9 @@
           </m:e>
           <m:sub>
             <m:r>
+              <m:rPr>
+                <m:sty m:val="p"/>
+              </m:rPr>
               <m:t>W</m:t>
             </m:r>
           </m:sub>
@@ -14315,6 +14501,9 @@
           </m:e>
           <m:sub>
             <m:r>
+              <m:rPr>
+                <m:sty m:val="p"/>
+              </m:rPr>
               <m:t>J</m:t>
             </m:r>
           </m:sub>
@@ -14345,6 +14534,9 @@
           </m:e>
           <m:sub>
             <m:r>
+              <m:rPr>
+                <m:sty m:val="p"/>
+              </m:rPr>
               <m:t>J</m:t>
             </m:r>
           </m:sub>
@@ -14374,6 +14566,9 @@
           </m:e>
           <m:sub>
             <m:r>
+              <m:rPr>
+                <m:sty m:val="p"/>
+              </m:rPr>
               <m:t>E</m:t>
             </m:r>
           </m:sub>
@@ -14475,6 +14670,9 @@
           </m:e>
           <m:sub>
             <m:r>
+              <m:rPr>
+                <m:sty m:val="p"/>
+              </m:rPr>
               <m:t>J</m:t>
             </m:r>
           </m:sub>
@@ -14546,6 +14744,9 @@
           </m:e>
           <m:sub>
             <m:r>
+              <m:rPr>
+                <m:sty m:val="p"/>
+              </m:rPr>
               <m:t>J</m:t>
             </m:r>
           </m:sub>
@@ -14767,6 +14968,9 @@
           </m:e>
           <m:sub>
             <m:r>
+              <m:rPr>
+                <m:sty m:val="p"/>
+              </m:rPr>
               <m:t>a</m:t>
             </m:r>
           </m:sub>
@@ -14787,6 +14991,9 @@
           </m:e>
           <m:sub>
             <m:r>
+              <m:rPr>
+                <m:sty m:val="p"/>
+              </m:rPr>
               <m:t>i</m:t>
             </m:r>
           </m:sub>
@@ -14862,6 +15069,9 @@
           </m:e>
           <m:sub>
             <m:r>
+              <m:rPr>
+                <m:sty m:val="p"/>
+              </m:rPr>
               <m:t>i</m:t>
             </m:r>
           </m:sub>
@@ -14885,6 +15095,9 @@
           </m:e>
           <m:sub>
             <m:r>
+              <m:rPr>
+                <m:sty m:val="p"/>
+              </m:rPr>
               <m:t>a</m:t>
             </m:r>
           </m:sub>
@@ -15005,6 +15218,9 @@
           </m:e>
           <m:sub>
             <m:r>
+              <m:rPr>
+                <m:sty m:val="p"/>
+              </m:rPr>
               <m:t>m</m:t>
             </m:r>
           </m:sub>
@@ -15183,6 +15399,9 @@
                 </m:e>
                 <m:sub>
                   <m:r>
+                    <m:rPr>
+                      <m:sty m:val="p"/>
+                    </m:rPr>
                     <m:t>i</m:t>
                   </m:r>
                 </m:sub>
@@ -15244,6 +15463,9 @@
                 </m:e>
                 <m:sub>
                   <m:r>
+                    <m:rPr>
+                      <m:sty m:val="p"/>
+                    </m:rPr>
                     <m:t>u</m:t>
                   </m:r>
                 </m:sub>
@@ -15316,6 +15538,9 @@
                 </m:e>
                 <m:sub>
                   <m:r>
+                    <m:rPr>
+                      <m:sty m:val="p"/>
+                    </m:rPr>
                     <m:t>i</m:t>
                   </m:r>
                 </m:sub>
@@ -15498,6 +15723,9 @@
                 </m:e>
                 <m:sub>
                   <m:r>
+                    <m:rPr>
+                      <m:sty m:val="p"/>
+                    </m:rPr>
                     <m:t>L</m:t>
                   </m:r>
                 </m:sub>
@@ -15633,6 +15861,9 @@
                 </m:e>
                 <m:sub>
                   <m:r>
+                    <m:rPr>
+                      <m:sty m:val="p"/>
+                    </m:rPr>
                     <m:t>L</m:t>
                   </m:r>
                 </m:sub>
@@ -15910,9 +16141,15 @@
                 </m:e>
                 <m:sub>
                   <m:r>
+                    <m:rPr>
+                      <m:sty m:val="p"/>
+                    </m:rPr>
                     <m:t>S</m:t>
                   </m:r>
                   <m:r>
+                    <m:rPr>
+                      <m:sty m:val="p"/>
+                    </m:rPr>
                     <m:t>t</m:t>
                   </m:r>
                 </m:sub>
@@ -15977,12 +16214,21 @@
                 </m:e>
                 <m:sub>
                   <m:r>
+                    <m:rPr>
+                      <m:sty m:val="p"/>
+                    </m:rPr>
                     <m:t>I</m:t>
                   </m:r>
                   <m:r>
+                    <m:rPr>
+                      <m:sty m:val="p"/>
+                    </m:rPr>
                     <m:t>s</m:t>
                   </m:r>
                   <m:r>
+                    <m:rPr>
+                      <m:sty m:val="p"/>
+                    </m:rPr>
                     <m:t>o</m:t>
                   </m:r>
                 </m:sub>
@@ -16058,9 +16304,15 @@
                 </m:e>
                 <m:sub>
                   <m:r>
+                    <m:rPr>
+                      <m:sty m:val="p"/>
+                    </m:rPr>
                     <m:t>S</m:t>
                   </m:r>
                   <m:r>
+                    <m:rPr>
+                      <m:sty m:val="p"/>
+                    </m:rPr>
                     <m:t>t</m:t>
                   </m:r>
                 </m:sub>
@@ -16131,12 +16383,21 @@
                 </m:e>
                 <m:sub>
                   <m:r>
+                    <m:rPr>
+                      <m:sty m:val="p"/>
+                    </m:rPr>
                     <m:t>I</m:t>
                   </m:r>
                   <m:r>
+                    <m:rPr>
+                      <m:sty m:val="p"/>
+                    </m:rPr>
                     <m:t>s</m:t>
                   </m:r>
                   <m:r>
+                    <m:rPr>
+                      <m:sty m:val="p"/>
+                    </m:rPr>
                     <m:t>o</m:t>
                   </m:r>
                 </m:sub>
@@ -16240,9 +16501,15 @@
                 </m:e>
                 <m:sub>
                   <m:r>
+                    <m:rPr>
+                      <m:sty m:val="p"/>
+                    </m:rPr>
                     <m:t>S</m:t>
                   </m:r>
                   <m:r>
+                    <m:rPr>
+                      <m:sty m:val="p"/>
+                    </m:rPr>
                     <m:t>t</m:t>
                   </m:r>
                 </m:sub>
@@ -16514,6 +16781,9 @@
           </m:e>
           <m:sub>
             <m:r>
+              <m:rPr>
+                <m:sty m:val="p"/>
+              </m:rPr>
               <m:t>a</m:t>
             </m:r>
           </m:sub>
@@ -16593,6 +16863,9 @@
           </m:e>
           <m:sub>
             <m:r>
+              <m:rPr>
+                <m:sty m:val="p"/>
+              </m:rPr>
               <m:t>m</m:t>
             </m:r>
           </m:sub>
@@ -16625,6 +16898,9 @@
           </m:e>
           <m:sub>
             <m:r>
+              <m:rPr>
+                <m:sty m:val="p"/>
+              </m:rPr>
               <m:t>a</m:t>
             </m:r>
           </m:sub>
@@ -16744,9 +17020,15 @@
           </m:e>
           <m:sub>
             <m:r>
+              <m:rPr>
+                <m:sty m:val="p"/>
+              </m:rPr>
               <m:t>t</m:t>
             </m:r>
             <m:r>
+              <m:rPr>
+                <m:sty m:val="p"/>
+              </m:rPr>
               <m:t>h</m:t>
             </m:r>
             <m:r>
@@ -16756,6 +17038,9 @@
               <m:t>,</m:t>
             </m:r>
             <m:r>
+              <m:rPr>
+                <m:sty m:val="p"/>
+              </m:rPr>
               <m:t>i</m:t>
             </m:r>
           </m:sub>
@@ -16842,9 +17127,15 @@
           </m:e>
           <m:sub>
             <m:r>
+              <m:rPr>
+                <m:sty m:val="p"/>
+              </m:rPr>
               <m:t>t</m:t>
             </m:r>
             <m:r>
+              <m:rPr>
+                <m:sty m:val="p"/>
+              </m:rPr>
               <m:t>h</m:t>
             </m:r>
             <m:r>
@@ -16854,9 +17145,15 @@
               <m:t>,</m:t>
             </m:r>
             <m:r>
+              <m:rPr>
+                <m:sty m:val="p"/>
+              </m:rPr>
               <m:t>S</m:t>
             </m:r>
             <m:r>
+              <m:rPr>
+                <m:sty m:val="p"/>
+              </m:rPr>
               <m:t>t</m:t>
             </m:r>
           </m:sub>
@@ -16943,9 +17240,15 @@
           </m:e>
           <m:sub>
             <m:r>
+              <m:rPr>
+                <m:sty m:val="p"/>
+              </m:rPr>
               <m:t>t</m:t>
             </m:r>
             <m:r>
+              <m:rPr>
+                <m:sty m:val="p"/>
+              </m:rPr>
               <m:t>h</m:t>
             </m:r>
             <m:r>
@@ -16955,12 +17258,21 @@
               <m:t>,</m:t>
             </m:r>
             <m:r>
+              <m:rPr>
+                <m:sty m:val="p"/>
+              </m:rPr>
               <m:t>I</m:t>
             </m:r>
             <m:r>
+              <m:rPr>
+                <m:sty m:val="p"/>
+              </m:rPr>
               <m:t>s</m:t>
             </m:r>
             <m:r>
+              <m:rPr>
+                <m:sty m:val="p"/>
+              </m:rPr>
               <m:t>o</m:t>
             </m:r>
           </m:sub>
@@ -17017,9 +17329,15 @@
           </m:e>
           <m:sub>
             <m:r>
+              <m:rPr>
+                <m:sty m:val="p"/>
+              </m:rPr>
               <m:t>t</m:t>
             </m:r>
             <m:r>
+              <m:rPr>
+                <m:sty m:val="p"/>
+              </m:rPr>
               <m:t>h</m:t>
             </m:r>
             <m:r>
@@ -17029,6 +17347,9 @@
               <m:t>,</m:t>
             </m:r>
             <m:r>
+              <m:rPr>
+                <m:sty m:val="p"/>
+              </m:rPr>
               <m:t>a</m:t>
             </m:r>
           </m:sub>
@@ -17091,9 +17412,15 @@
           </m:e>
           <m:sub>
             <m:r>
+              <m:rPr>
+                <m:sty m:val="p"/>
+              </m:rPr>
               <m:t>t</m:t>
             </m:r>
             <m:r>
+              <m:rPr>
+                <m:sty m:val="p"/>
+              </m:rPr>
               <m:t>h</m:t>
             </m:r>
             <m:r>
@@ -17103,12 +17430,21 @@
               <m:t>,</m:t>
             </m:r>
             <m:r>
+              <m:rPr>
+                <m:sty m:val="p"/>
+              </m:rPr>
               <m:t>g</m:t>
             </m:r>
             <m:r>
+              <m:rPr>
+                <m:sty m:val="p"/>
+              </m:rPr>
               <m:t>e</m:t>
             </m:r>
             <m:r>
+              <m:rPr>
+                <m:sty m:val="p"/>
+              </m:rPr>
               <m:t>s</m:t>
             </m:r>
           </m:sub>
@@ -17215,6 +17551,9 @@
           </m:e>
           <m:sub>
             <m:r>
+              <m:rPr>
+                <m:sty m:val="p"/>
+              </m:rPr>
               <m:t>O</m:t>
             </m:r>
           </m:sub>
@@ -17238,6 +17577,9 @@
           </m:e>
           <m:sub>
             <m:r>
+              <m:rPr>
+                <m:sty m:val="p"/>
+              </m:rPr>
               <m:t>O</m:t>
             </m:r>
           </m:sub>
@@ -17300,6 +17642,9 @@
           </m:e>
           <m:sub>
             <m:r>
+              <m:rPr>
+                <m:sty m:val="p"/>
+              </m:rPr>
               <m:t>m</m:t>
             </m:r>
           </m:sub>
@@ -17367,6 +17712,9 @@
           </m:e>
           <m:sub>
             <m:r>
+              <m:rPr>
+                <m:sty m:val="p"/>
+              </m:rPr>
               <m:t>i</m:t>
             </m:r>
           </m:sub>
@@ -17387,6 +17735,9 @@
           </m:e>
           <m:sub>
             <m:r>
+              <m:rPr>
+                <m:sty m:val="p"/>
+              </m:rPr>
               <m:t>i</m:t>
             </m:r>
           </m:sub>
@@ -17410,6 +17761,9 @@
           </m:e>
           <m:sub>
             <m:r>
+              <m:rPr>
+                <m:sty m:val="p"/>
+              </m:rPr>
               <m:t>a</m:t>
             </m:r>
           </m:sub>
@@ -17430,6 +17784,9 @@
           </m:e>
           <m:sub>
             <m:r>
+              <m:rPr>
+                <m:sty m:val="p"/>
+              </m:rPr>
               <m:t>a</m:t>
             </m:r>
           </m:sub>
@@ -17453,6 +17810,9 @@
           </m:e>
           <m:sub>
             <m:r>
+              <m:rPr>
+                <m:sty m:val="p"/>
+              </m:rPr>
               <m:t>i</m:t>
             </m:r>
           </m:sub>
@@ -17465,6 +17825,9 @@
           </m:e>
           <m:sub>
             <m:r>
+              <m:rPr>
+                <m:sty m:val="p"/>
+              </m:rPr>
               <m:t>i</m:t>
             </m:r>
           </m:sub>
@@ -17483,6 +17846,9 @@
           </m:e>
           <m:sub>
             <m:r>
+              <m:rPr>
+                <m:sty m:val="p"/>
+              </m:rPr>
               <m:t>a</m:t>
             </m:r>
           </m:sub>
@@ -17495,6 +17861,9 @@
           </m:e>
           <m:sub>
             <m:r>
+              <m:rPr>
+                <m:sty m:val="p"/>
+              </m:rPr>
               <m:t>a</m:t>
             </m:r>
           </m:sub>
@@ -17518,6 +17887,9 @@
           </m:e>
           <m:sub>
             <m:r>
+              <m:rPr>
+                <m:sty m:val="p"/>
+              </m:rPr>
               <m:t>i</m:t>
             </m:r>
           </m:sub>
@@ -17614,6 +17986,9 @@
           </m:e>
           <m:sub>
             <m:r>
+              <m:rPr>
+                <m:sty m:val="p"/>
+              </m:rPr>
               <m:t>a</m:t>
             </m:r>
           </m:sub>
@@ -17710,6 +18085,9 @@
           </m:e>
           <m:sub>
             <m:r>
+              <m:rPr>
+                <m:sty m:val="p"/>
+              </m:rPr>
               <m:t>i</m:t>
             </m:r>
           </m:sub>
@@ -17722,6 +18100,9 @@
           </m:e>
           <m:sub>
             <m:r>
+              <m:rPr>
+                <m:sty m:val="p"/>
+              </m:rPr>
               <m:t>i</m:t>
             </m:r>
           </m:sub>
@@ -17740,6 +18121,9 @@
           </m:e>
           <m:sub>
             <m:r>
+              <m:rPr>
+                <m:sty m:val="p"/>
+              </m:rPr>
               <m:t>a</m:t>
             </m:r>
           </m:sub>
@@ -17752,6 +18136,9 @@
           </m:e>
           <m:sub>
             <m:r>
+              <m:rPr>
+                <m:sty m:val="p"/>
+              </m:rPr>
               <m:t>a</m:t>
             </m:r>
           </m:sub>
@@ -17819,9 +18206,15 @@
           </m:e>
           <m:sub>
             <m:r>
+              <m:rPr>
+                <m:sty m:val="p"/>
+              </m:rPr>
               <m:t>t</m:t>
             </m:r>
             <m:r>
+              <m:rPr>
+                <m:sty m:val="p"/>
+              </m:rPr>
               <m:t>h</m:t>
             </m:r>
             <m:r>
@@ -17831,12 +18224,21 @@
               <m:t>,</m:t>
             </m:r>
             <m:r>
+              <m:rPr>
+                <m:sty m:val="p"/>
+              </m:rPr>
               <m:t>g</m:t>
             </m:r>
             <m:r>
+              <m:rPr>
+                <m:sty m:val="p"/>
+              </m:rPr>
               <m:t>e</m:t>
             </m:r>
             <m:r>
+              <m:rPr>
+                <m:sty m:val="p"/>
+              </m:rPr>
               <m:t>s</m:t>
             </m:r>
           </m:sub>
@@ -17860,15 +18262,27 @@
           </m:e>
           <m:sub>
             <m:r>
+              <m:rPr>
+                <m:sty m:val="p"/>
+              </m:rPr>
               <m:t>k</m:t>
             </m:r>
             <m:r>
+              <m:rPr>
+                <m:sty m:val="p"/>
+              </m:rPr>
               <m:t>r</m:t>
             </m:r>
             <m:r>
+              <m:rPr>
+                <m:sty m:val="p"/>
+              </m:rPr>
               <m:t>i</m:t>
             </m:r>
             <m:r>
+              <m:rPr>
+                <m:sty m:val="p"/>
+              </m:rPr>
               <m:t>t</m:t>
             </m:r>
           </m:sub>
@@ -17892,15 +18306,27 @@
           </m:e>
           <m:sub>
             <m:r>
+              <m:rPr>
+                <m:sty m:val="p"/>
+              </m:rPr>
               <m:t>k</m:t>
             </m:r>
             <m:r>
+              <m:rPr>
+                <m:sty m:val="p"/>
+              </m:rPr>
               <m:t>r</m:t>
             </m:r>
             <m:r>
+              <m:rPr>
+                <m:sty m:val="p"/>
+              </m:rPr>
               <m:t>i</m:t>
             </m:r>
             <m:r>
+              <m:rPr>
+                <m:sty m:val="p"/>
+              </m:rPr>
               <m:t>t</m:t>
             </m:r>
           </m:sub>
@@ -17919,12 +18345,21 @@
           </m:e>
           <m:sub>
             <m:r>
+              <m:rPr>
+                <m:sty m:val="p"/>
+              </m:rPr>
               <m:t>I</m:t>
             </m:r>
             <m:r>
+              <m:rPr>
+                <m:sty m:val="p"/>
+              </m:rPr>
               <m:t>s</m:t>
             </m:r>
             <m:r>
+              <m:rPr>
+                <m:sty m:val="p"/>
+              </m:rPr>
               <m:t>o</m:t>
             </m:r>
           </m:sub>
@@ -17943,6 +18378,9 @@
           </m:e>
           <m:sub>
             <m:r>
+              <m:rPr>
+                <m:sty m:val="p"/>
+              </m:rPr>
               <m:t>a</m:t>
             </m:r>
           </m:sub>
@@ -18188,9 +18626,15 @@
           </m:e>
           <m:sub>
             <m:r>
+              <m:rPr>
+                <m:sty m:val="p"/>
+              </m:rPr>
               <m:t>t</m:t>
             </m:r>
             <m:r>
+              <m:rPr>
+                <m:sty m:val="p"/>
+              </m:rPr>
               <m:t>h</m:t>
             </m:r>
             <m:r>
@@ -18200,12 +18644,21 @@
               <m:t>,</m:t>
             </m:r>
             <m:r>
+              <m:rPr>
+                <m:sty m:val="p"/>
+              </m:rPr>
               <m:t>g</m:t>
             </m:r>
             <m:r>
+              <m:rPr>
+                <m:sty m:val="p"/>
+              </m:rPr>
               <m:t>e</m:t>
             </m:r>
             <m:r>
+              <m:rPr>
+                <m:sty m:val="p"/>
+              </m:rPr>
               <m:t>s</m:t>
             </m:r>
           </m:sub>
@@ -18226,9 +18679,15 @@
           </m:e>
           <m:sub>
             <m:r>
+              <m:rPr>
+                <m:sty m:val="p"/>
+              </m:rPr>
               <m:t>t</m:t>
             </m:r>
             <m:r>
+              <m:rPr>
+                <m:sty m:val="p"/>
+              </m:rPr>
               <m:t>h</m:t>
             </m:r>
             <m:r>
@@ -18238,12 +18697,21 @@
               <m:t>,</m:t>
             </m:r>
             <m:r>
+              <m:rPr>
+                <m:sty m:val="p"/>
+              </m:rPr>
               <m:t>g</m:t>
             </m:r>
             <m:r>
+              <m:rPr>
+                <m:sty m:val="p"/>
+              </m:rPr>
               <m:t>e</m:t>
             </m:r>
             <m:r>
+              <m:rPr>
+                <m:sty m:val="p"/>
+              </m:rPr>
               <m:t>s</m:t>
             </m:r>
           </m:sub>
@@ -18816,6 +19284,9 @@
           </m:e>
           <m:sub>
             <m:r>
+              <m:rPr>
+                <m:sty m:val="p"/>
+              </m:rPr>
               <m:t>p</m:t>
             </m:r>
           </m:sub>
@@ -18863,6 +19334,9 @@
           </m:e>
           <m:sub>
             <m:r>
+              <m:rPr>
+                <m:sty m:val="p"/>
+              </m:rPr>
               <m:t>A</m:t>
             </m:r>
           </m:sub>
@@ -18883,6 +19357,9 @@
           </m:e>
           <m:sub>
             <m:r>
+              <m:rPr>
+                <m:sty m:val="p"/>
+              </m:rPr>
               <m:t>A</m:t>
             </m:r>
           </m:sub>
@@ -19095,6 +19572,9 @@
                 </m:e>
                 <m:sub>
                   <m:r>
+                    <m:rPr>
+                      <m:sty m:val="p"/>
+                    </m:rPr>
                     <m:t>p</m:t>
                   </m:r>
                 </m:sub>
@@ -19173,6 +19653,9 @@
                 </m:e>
                 <m:sub>
                   <m:r>
+                    <m:rPr>
+                      <m:sty m:val="p"/>
+                    </m:rPr>
                     <m:t>O</m:t>
                   </m:r>
                 </m:sub>
@@ -19258,6 +19741,9 @@
                 </m:e>
                 <m:sub>
                   <m:r>
+                    <m:rPr>
+                      <m:sty m:val="p"/>
+                    </m:rPr>
                     <m:t>E</m:t>
                   </m:r>
                 </m:sub>
@@ -19886,6 +20372,9 @@
           </m:e>
           <m:sub>
             <m:r>
+              <m:rPr>
+                <m:sty m:val="p"/>
+              </m:rPr>
               <m:t>p</m:t>
             </m:r>
           </m:sub>
@@ -19957,12 +20446,21 @@
           </m:e>
           <m:sub>
             <m:r>
+              <m:rPr>
+                <m:sty m:val="p"/>
+              </m:rPr>
               <m:t>a</m:t>
             </m:r>
             <m:r>
+              <m:rPr>
+                <m:sty m:val="p"/>
+              </m:rPr>
               <m:t>b</m:t>
             </m:r>
             <m:r>
+              <m:rPr>
+                <m:sty m:val="p"/>
+              </m:rPr>
               <m:t>s</m:t>
             </m:r>
           </m:sub>
@@ -19990,12 +20488,21 @@
           </m:e>
           <m:sub>
             <m:r>
+              <m:rPr>
+                <m:sty m:val="p"/>
+              </m:rPr>
               <m:t>a</m:t>
             </m:r>
             <m:r>
+              <m:rPr>
+                <m:sty m:val="p"/>
+              </m:rPr>
               <m:t>b</m:t>
             </m:r>
             <m:r>
+              <m:rPr>
+                <m:sty m:val="p"/>
+              </m:rPr>
               <m:t>s</m:t>
             </m:r>
           </m:sub>
@@ -20066,6 +20573,9 @@
           </m:e>
           <m:sub>
             <m:r>
+              <m:rPr>
+                <m:sty m:val="p"/>
+              </m:rPr>
               <m:t>e</m:t>
             </m:r>
           </m:sub>
@@ -20106,6 +20616,9 @@
           </m:e>
           <m:sub>
             <m:r>
+              <m:rPr>
+                <m:sty m:val="p"/>
+              </m:rPr>
               <m:t>e</m:t>
             </m:r>
           </m:sub>
@@ -20238,6 +20751,9 @@
           </m:e>
           <m:sub>
             <m:r>
+              <m:rPr>
+                <m:sty m:val="p"/>
+              </m:rPr>
               <m:t>A</m:t>
             </m:r>
           </m:sub>
@@ -20256,6 +20772,9 @@
           </m:e>
           <m:sub>
             <m:r>
+              <m:rPr>
+                <m:sty m:val="p"/>
+              </m:rPr>
               <m:t>A</m:t>
             </m:r>
           </m:sub>
@@ -20329,6 +20848,9 @@
           </m:e>
           <m:sub>
             <m:r>
+              <m:rPr>
+                <m:sty m:val="p"/>
+              </m:rPr>
               <m:t>O</m:t>
             </m:r>
           </m:sub>
@@ -20352,6 +20874,9 @@
           </m:e>
           <m:sub>
             <m:r>
+              <m:rPr>
+                <m:sty m:val="p"/>
+              </m:rPr>
               <m:t>e</m:t>
             </m:r>
           </m:sub>
@@ -20375,6 +20900,9 @@
           </m:e>
           <m:sub>
             <m:r>
+              <m:rPr>
+                <m:sty m:val="p"/>
+              </m:rPr>
               <m:t>A</m:t>
             </m:r>
           </m:sub>
@@ -20398,6 +20926,9 @@
           </m:e>
           <m:sub>
             <m:r>
+              <m:rPr>
+                <m:sty m:val="p"/>
+              </m:rPr>
               <m:t>A</m:t>
             </m:r>
           </m:sub>
@@ -20421,6 +20952,9 @@
           </m:e>
           <m:sub>
             <m:r>
+              <m:rPr>
+                <m:sty m:val="p"/>
+              </m:rPr>
               <m:t>O</m:t>
             </m:r>
           </m:sub>
@@ -20459,6 +20993,9 @@
           </m:e>
           <m:sub>
             <m:r>
+              <m:rPr>
+                <m:sty m:val="p"/>
+              </m:rPr>
               <m:t>A</m:t>
             </m:r>
           </m:sub>
@@ -20482,6 +21019,9 @@
           </m:e>
           <m:sub>
             <m:r>
+              <m:rPr>
+                <m:sty m:val="p"/>
+              </m:rPr>
               <m:t>O</m:t>
             </m:r>
           </m:sub>
@@ -20500,6 +21040,9 @@
           </m:e>
           <m:sub>
             <m:r>
+              <m:rPr>
+                <m:sty m:val="p"/>
+              </m:rPr>
               <m:t>e</m:t>
             </m:r>
           </m:sub>
@@ -20541,6 +21084,9 @@
                       </m:e>
                       <m:sub>
                         <m:r>
+                          <m:rPr>
+                            <m:sty m:val="p"/>
+                          </m:rPr>
                           <m:t>A</m:t>
                         </m:r>
                       </m:sub>
@@ -20584,6 +21130,9 @@
           </m:e>
           <m:sub>
             <m:r>
+              <m:rPr>
+                <m:sty m:val="p"/>
+              </m:rPr>
               <m:t>A</m:t>
             </m:r>
           </m:sub>
@@ -20625,6 +21174,9 @@
           </m:e>
           <m:sub>
             <m:r>
+              <m:rPr>
+                <m:sty m:val="p"/>
+              </m:rPr>
               <m:t>A</m:t>
             </m:r>
           </m:sub>
@@ -20680,6 +21232,9 @@
           </m:e>
           <m:sub>
             <m:r>
+              <m:rPr>
+                <m:sty m:val="p"/>
+              </m:rPr>
               <m:t>A</m:t>
             </m:r>
           </m:sub>
@@ -20712,6 +21267,9 @@
           </m:e>
           <m:sub>
             <m:r>
+              <m:rPr>
+                <m:sty m:val="p"/>
+              </m:rPr>
               <m:t>A</m:t>
             </m:r>
           </m:sub>
@@ -20748,6 +21306,9 @@
           </m:e>
           <m:sub>
             <m:r>
+              <m:rPr>
+                <m:sty m:val="p"/>
+              </m:rPr>
               <m:t>G</m:t>
             </m:r>
           </m:sub>
@@ -20777,6 +21338,9 @@
           </m:e>
           <m:sub>
             <m:r>
+              <m:rPr>
+                <m:sty m:val="p"/>
+              </m:rPr>
               <m:t>O</m:t>
             </m:r>
           </m:sub>
@@ -20863,6 +21427,9 @@
           </m:e>
           <m:sub>
             <m:r>
+              <m:rPr>
+                <m:sty m:val="p"/>
+              </m:rPr>
               <m:t>G</m:t>
             </m:r>
           </m:sub>
@@ -21011,6 +21578,9 @@
           </m:e>
           <m:sub>
             <m:r>
+              <m:rPr>
+                <m:sty m:val="p"/>
+              </m:rPr>
               <m:t>e</m:t>
             </m:r>
           </m:sub>
@@ -21054,6 +21624,9 @@
           </m:e>
           <m:sub>
             <m:r>
+              <m:rPr>
+                <m:sty m:val="p"/>
+              </m:rPr>
               <m:t>e</m:t>
             </m:r>
           </m:sub>
@@ -21272,6 +21845,9 @@
           </m:e>
           <m:sub>
             <m:r>
+              <m:rPr>
+                <m:sty m:val="p"/>
+              </m:rPr>
               <m:t>L</m:t>
             </m:r>
           </m:sub>
@@ -21316,6 +21892,9 @@
           </m:e>
           <m:sub>
             <m:r>
+              <m:rPr>
+                <m:sty m:val="p"/>
+              </m:rPr>
               <m:t>H</m:t>
             </m:r>
           </m:sub>
@@ -21395,6 +21974,9 @@
           </m:e>
           <m:sub>
             <m:r>
+              <m:rPr>
+                <m:sty m:val="p"/>
+              </m:rPr>
               <m:t>L</m:t>
             </m:r>
           </m:sub>
@@ -21529,6 +22111,9 @@
           </m:e>
           <m:sub>
             <m:r>
+              <m:rPr>
+                <m:sty m:val="p"/>
+              </m:rPr>
               <m:t>L</m:t>
             </m:r>
           </m:sub>
@@ -21552,6 +22137,9 @@
           </m:e>
           <m:sub>
             <m:r>
+              <m:rPr>
+                <m:sty m:val="p"/>
+              </m:rPr>
               <m:t>L</m:t>
             </m:r>
           </m:sub>
@@ -21689,6 +22277,9 @@
           </m:e>
           <m:sub>
             <m:r>
+              <m:rPr>
+                <m:sty m:val="p"/>
+              </m:rPr>
               <m:t>L</m:t>
             </m:r>
           </m:sub>
@@ -21891,6 +22482,9 @@
           </m:e>
           <m:sub>
             <m:r>
+              <m:rPr>
+                <m:sty m:val="p"/>
+              </m:rPr>
               <m:t>H</m:t>
             </m:r>
           </m:sub>
@@ -21941,6 +22535,9 @@
           </m:e>
           <m:sub>
             <m:r>
+              <m:rPr>
+                <m:sty m:val="p"/>
+              </m:rPr>
               <m:t>L</m:t>
             </m:r>
           </m:sub>
@@ -21964,6 +22561,9 @@
           </m:e>
           <m:sub>
             <m:r>
+              <m:rPr>
+                <m:sty m:val="p"/>
+              </m:rPr>
               <m:t>L</m:t>
             </m:r>
           </m:sub>
@@ -22062,6 +22662,9 @@
           </m:e>
           <m:sub>
             <m:r>
+              <m:rPr>
+                <m:sty m:val="p"/>
+              </m:rPr>
               <m:t>L</m:t>
             </m:r>
           </m:sub>
@@ -22085,6 +22688,9 @@
           </m:e>
           <m:sub>
             <m:r>
+              <m:rPr>
+                <m:sty m:val="p"/>
+              </m:rPr>
               <m:t>L</m:t>
             </m:r>
           </m:sub>
@@ -22146,6 +22752,9 @@
           </m:e>
           <m:sub>
             <m:r>
+              <m:rPr>
+                <m:sty m:val="p"/>
+              </m:rPr>
               <m:t>L</m:t>
             </m:r>
           </m:sub>
@@ -22230,6 +22839,9 @@
           </m:e>
           <m:sub>
             <m:r>
+              <m:rPr>
+                <m:sty m:val="p"/>
+              </m:rPr>
               <m:t>L</m:t>
             </m:r>
           </m:sub>
@@ -26269,6 +26881,9 @@
                 </m:e>
                 <m:sub>
                   <m:r>
+                    <m:rPr>
+                      <m:sty m:val="p"/>
+                    </m:rPr>
                     <m:t>M</m:t>
                   </m:r>
                 </m:sub>
@@ -26366,15 +26981,27 @@
                 </m:e>
                 <m:sub>
                   <m:r>
+                    <m:rPr>
+                      <m:sty m:val="p"/>
+                    </m:rPr>
                     <m:t>A</m:t>
                   </m:r>
                   <m:r>
+                    <m:rPr>
+                      <m:sty m:val="p"/>
+                    </m:rPr>
                     <m:t>M</m:t>
                   </m:r>
                   <m:r>
+                    <m:rPr>
+                      <m:sty m:val="p"/>
+                    </m:rPr>
                     <m:t>O</m:t>
                   </m:r>
                   <m:r>
+                    <m:rPr>
+                      <m:sty m:val="p"/>
+                    </m:rPr>
                     <m:t>C</m:t>
                   </m:r>
                 </m:sub>
@@ -26454,6 +27081,9 @@
                     <m:t>,</m:t>
                   </m:r>
                   <m:r>
+                    <m:rPr>
+                      <m:sty m:val="p"/>
+                    </m:rPr>
                     <m:t>M</m:t>
                   </m:r>
                 </m:sub>
@@ -26648,6 +27278,9 @@
                 </m:e>
                 <m:sub>
                   <m:r>
+                    <m:rPr>
+                      <m:sty m:val="p"/>
+                    </m:rPr>
                     <m:t>w</m:t>
                   </m:r>
                 </m:sub>
@@ -26732,6 +27365,9 @@
                 </m:e>
                 <m:sub>
                   <m:r>
+                    <m:rPr>
+                      <m:sty m:val="p"/>
+                    </m:rPr>
                     <m:t>k</m:t>
                   </m:r>
                 </m:sub>
@@ -26907,6 +27543,9 @@
                 </m:e>
                 <m:sub>
                   <m:r>
+                    <m:rPr>
+                      <m:sty m:val="p"/>
+                    </m:rPr>
                     <m:t>A</m:t>
                   </m:r>
                 </m:sub>
@@ -26977,6 +27616,9 @@
                 </m:e>
                 <m:sub>
                   <m:r>
+                    <m:rPr>
+                      <m:sty m:val="p"/>
+                    </m:rPr>
                     <m:t>G</m:t>
                   </m:r>
                 </m:sub>
@@ -27083,6 +27725,9 @@
                 </m:e>
                 <m:sub>
                   <m:r>
+                    <m:rPr>
+                      <m:sty m:val="p"/>
+                    </m:rPr>
                     <m:t>G</m:t>
                   </m:r>
                 </m:sub>
@@ -27144,6 +27789,9 @@
                 </m:e>
                 <m:sub>
                   <m:r>
+                    <m:rPr>
+                      <m:sty m:val="p"/>
+                    </m:rPr>
                     <m:t>V</m:t>
                   </m:r>
                 </m:sub>
@@ -27352,6 +28000,9 @@
                 </m:e>
                 <m:sub>
                   <m:r>
+                    <m:rPr>
+                      <m:sty m:val="p"/>
+                    </m:rPr>
                     <m:t>S</m:t>
                   </m:r>
                 </m:sub>
@@ -27431,9 +28082,15 @@
                 </m:e>
                 <m:sub>
                   <m:r>
+                    <m:rPr>
+                      <m:sty m:val="p"/>
+                    </m:rPr>
                     <m:t>P</m:t>
                   </m:r>
                   <m:r>
+                    <m:rPr>
+                      <m:sty m:val="p"/>
+                    </m:rPr>
                     <m:t>B</m:t>
                   </m:r>
                 </m:sub>
@@ -27509,6 +28166,9 @@
                 </m:e>
                 <m:sub>
                   <m:r>
+                    <m:rPr>
+                      <m:sty m:val="p"/>
+                    </m:rPr>
                     <m:t>p</m:t>
                   </m:r>
                 </m:sub>
@@ -27564,9 +28224,15 @@
                 </m:e>
                 <m:sub>
                   <m:r>
+                    <m:rPr>
+                      <m:sty m:val="p"/>
+                    </m:rPr>
                     <m:t>G</m:t>
                   </m:r>
                   <m:r>
+                    <m:rPr>
+                      <m:sty m:val="p"/>
+                    </m:rPr>
                     <m:t>B</m:t>
                   </m:r>
                 </m:sub>
@@ -27648,6 +28314,9 @@
                 </m:e>
                 <m:sub>
                   <m:r>
+                    <m:rPr>
+                      <m:sty m:val="p"/>
+                    </m:rPr>
                     <m:t>A</m:t>
                   </m:r>
                 </m:sub>
@@ -28312,6 +28981,9 @@
           </m:e>
           <m:sub>
             <m:r>
+              <m:rPr>
+                <m:sty m:val="p"/>
+              </m:rPr>
               <m:t>A</m:t>
             </m:r>
           </m:sub>
@@ -28396,6 +29068,9 @@
               <m:t>,</m:t>
             </m:r>
             <m:r>
+              <m:rPr>
+                <m:sty m:val="p"/>
+              </m:rPr>
               <m:t>M</m:t>
             </m:r>
           </m:sub>
@@ -28443,15 +29118,27 @@
           </m:e>
           <m:sub>
             <m:r>
+              <m:rPr>
+                <m:sty m:val="p"/>
+              </m:rPr>
               <m:t>A</m:t>
             </m:r>
             <m:r>
+              <m:rPr>
+                <m:sty m:val="p"/>
+              </m:rPr>
               <m:t>M</m:t>
             </m:r>
             <m:r>
+              <m:rPr>
+                <m:sty m:val="p"/>
+              </m:rPr>
               <m:t>O</m:t>
             </m:r>
             <m:r>
+              <m:rPr>
+                <m:sty m:val="p"/>
+              </m:rPr>
               <m:t>C</m:t>
             </m:r>
           </m:sub>
@@ -28475,6 +29162,9 @@
           </m:e>
           <m:sub>
             <m:r>
+              <m:rPr>
+                <m:sty m:val="p"/>
+              </m:rPr>
               <m:t>w</m:t>
             </m:r>
           </m:sub>
@@ -28498,6 +29188,9 @@
           </m:e>
           <m:sub>
             <m:r>
+              <m:rPr>
+                <m:sty m:val="p"/>
+              </m:rPr>
               <m:t>k</m:t>
             </m:r>
           </m:sub>
@@ -28525,6 +29218,9 @@
           </m:e>
           <m:sub>
             <m:r>
+              <m:rPr>
+                <m:sty m:val="p"/>
+              </m:rPr>
               <m:t>G</m:t>
             </m:r>
           </m:sub>
@@ -28676,6 +29372,9 @@
               </m:e>
               <m:sub>
                 <m:r>
+                  <m:rPr>
+                    <m:sty m:val="p"/>
+                  </m:rPr>
                   <m:t>w</m:t>
                 </m:r>
               </m:sub>
@@ -28694,6 +29393,9 @@
               </m:e>
               <m:sub>
                 <m:r>
+                  <m:rPr>
+                    <m:sty m:val="p"/>
+                  </m:rPr>
                   <m:t>k</m:t>
                 </m:r>
               </m:sub>
@@ -28764,15 +29466,27 @@
           </m:e>
           <m:sub>
             <m:r>
+              <m:rPr>
+                <m:sty m:val="p"/>
+              </m:rPr>
               <m:t>A</m:t>
             </m:r>
             <m:r>
+              <m:rPr>
+                <m:sty m:val="p"/>
+              </m:rPr>
               <m:t>M</m:t>
             </m:r>
             <m:r>
+              <m:rPr>
+                <m:sty m:val="p"/>
+              </m:rPr>
               <m:t>O</m:t>
             </m:r>
             <m:r>
+              <m:rPr>
+                <m:sty m:val="p"/>
+              </m:rPr>
               <m:t>C</m:t>
             </m:r>
           </m:sub>
@@ -28793,6 +29507,9 @@
           </m:e>
           <m:sub>
             <m:r>
+              <m:rPr>
+                <m:sty m:val="p"/>
+              </m:rPr>
               <m:t>G</m:t>
             </m:r>
           </m:sub>
@@ -28810,6 +29527,9 @@
           </m:e>
           <m:sub>
             <m:r>
+              <m:rPr>
+                <m:sty m:val="p"/>
+              </m:rPr>
               <m:t>V</m:t>
             </m:r>
           </m:sub>
@@ -28837,6 +29557,9 @@
           </m:e>
           <m:sub>
             <m:r>
+              <m:rPr>
+                <m:sty m:val="p"/>
+              </m:rPr>
               <m:t>G</m:t>
             </m:r>
           </m:sub>
@@ -28918,6 +29641,9 @@
           </m:e>
           <m:sub>
             <m:r>
+              <m:rPr>
+                <m:sty m:val="p"/>
+              </m:rPr>
               <m:t>V</m:t>
             </m:r>
           </m:sub>
@@ -28997,6 +29723,9 @@
           </m:e>
           <m:sub>
             <m:r>
+              <m:rPr>
+                <m:sty m:val="p"/>
+              </m:rPr>
               <m:t>O</m:t>
             </m:r>
           </m:sub>
@@ -29015,6 +29744,9 @@
           </m:e>
           <m:sub>
             <m:r>
+              <m:rPr>
+                <m:sty m:val="p"/>
+              </m:rPr>
               <m:t>e</m:t>
             </m:r>
           </m:sub>
@@ -29066,6 +29798,9 @@
                       </m:e>
                       <m:sub>
                         <m:r>
+                          <m:rPr>
+                            <m:sty m:val="p"/>
+                          </m:rPr>
                           <m:t>A</m:t>
                         </m:r>
                       </m:sub>
@@ -29119,12 +29854,21 @@
           </m:e>
           <m:sub>
             <m:r>
+              <m:rPr>
+                <m:sty m:val="p"/>
+              </m:rPr>
               <m:t>a</m:t>
             </m:r>
             <m:r>
+              <m:rPr>
+                <m:sty m:val="p"/>
+              </m:rPr>
               <m:t>b</m:t>
             </m:r>
             <m:r>
+              <m:rPr>
+                <m:sty m:val="p"/>
+              </m:rPr>
               <m:t>s</m:t>
             </m:r>
           </m:sub>
@@ -29199,6 +29943,9 @@
           </m:e>
           <m:sub>
             <m:r>
+              <m:rPr>
+                <m:sty m:val="p"/>
+              </m:rPr>
               <m:t>e</m:t>
             </m:r>
           </m:sub>
@@ -29258,6 +30005,9 @@
           </m:e>
           <m:sub>
             <m:r>
+              <m:rPr>
+                <m:sty m:val="p"/>
+              </m:rPr>
               <m:t>O</m:t>
             </m:r>
           </m:sub>
@@ -29332,9 +30082,15 @@
           </m:e>
           <m:sub>
             <m:r>
+              <m:rPr>
+                <m:sty m:val="p"/>
+              </m:rPr>
               <m:t>z</m:t>
             </m:r>
             <m:r>
+              <m:rPr>
+                <m:sty m:val="p"/>
+              </m:rPr>
               <m:t>u</m:t>
             </m:r>
           </m:sub>
@@ -29358,9 +30114,15 @@
           </m:e>
           <m:sub>
             <m:r>
+              <m:rPr>
+                <m:sty m:val="p"/>
+              </m:rPr>
               <m:t>P</m:t>
             </m:r>
             <m:r>
+              <m:rPr>
+                <m:sty m:val="p"/>
+              </m:rPr>
               <m:t>B</m:t>
             </m:r>
           </m:sub>
@@ -29407,6 +30169,9 @@
               </m:e>
               <m:sub>
                 <m:r>
+                  <m:rPr>
+                    <m:sty m:val="p"/>
+                  </m:rPr>
                   <m:t>A</m:t>
                 </m:r>
               </m:sub>
@@ -29522,9 +30287,15 @@
           </m:e>
           <m:sub>
             <m:r>
+              <m:rPr>
+                <m:sty m:val="p"/>
+              </m:rPr>
               <m:t>z</m:t>
             </m:r>
             <m:r>
+              <m:rPr>
+                <m:sty m:val="p"/>
+              </m:rPr>
               <m:t>u</m:t>
             </m:r>
           </m:sub>
@@ -29642,6 +30413,9 @@
           </m:e>
           <m:sub>
             <m:r>
+              <m:rPr>
+                <m:sty m:val="p"/>
+              </m:rPr>
               <m:t>p</m:t>
             </m:r>
           </m:sub>
@@ -29710,9 +30484,15 @@
           </m:e>
           <m:sub>
             <m:r>
+              <m:rPr>
+                <m:sty m:val="p"/>
+              </m:rPr>
               <m:t>z</m:t>
             </m:r>
             <m:r>
+              <m:rPr>
+                <m:sty m:val="p"/>
+              </m:rPr>
               <m:t>u</m:t>
             </m:r>
           </m:sub>
@@ -29921,6 +30701,9 @@
           </m:e>
           <m:sub>
             <m:r>
+              <m:rPr>
+                <m:sty m:val="p"/>
+              </m:rPr>
               <m:t>S</m:t>
             </m:r>
           </m:sub>
@@ -29953,6 +30736,9 @@
           </m:e>
           <m:sub>
             <m:r>
+              <m:rPr>
+                <m:sty m:val="p"/>
+              </m:rPr>
               <m:t>S</m:t>
             </m:r>
           </m:sub>
@@ -30009,6 +30795,9 @@
               </m:e>
               <m:sub>
                 <m:r>
+                  <m:rPr>
+                    <m:sty m:val="p"/>
+                  </m:rPr>
                   <m:t>A</m:t>
                 </m:r>
               </m:sub>
@@ -30040,9 +30829,15 @@
           </m:e>
           <m:sub>
             <m:r>
+              <m:rPr>
+                <m:sty m:val="p"/>
+              </m:rPr>
               <m:t>P</m:t>
             </m:r>
             <m:r>
+              <m:rPr>
+                <m:sty m:val="p"/>
+              </m:rPr>
               <m:t>B</m:t>
             </m:r>
           </m:sub>
@@ -30063,6 +30858,9 @@
           </m:e>
           <m:sub>
             <m:r>
+              <m:rPr>
+                <m:sty m:val="p"/>
+              </m:rPr>
               <m:t>S</m:t>
             </m:r>
           </m:sub>
@@ -30100,15 +30898,27 @@
           </m:e>
           <m:sub>
             <m:r>
+              <m:rPr>
+                <m:sty m:val="p"/>
+              </m:rPr>
               <m:t>A</m:t>
             </m:r>
             <m:r>
+              <m:rPr>
+                <m:sty m:val="p"/>
+              </m:rPr>
               <m:t>M</m:t>
             </m:r>
             <m:r>
+              <m:rPr>
+                <m:sty m:val="p"/>
+              </m:rPr>
               <m:t>O</m:t>
             </m:r>
             <m:r>
+              <m:rPr>
+                <m:sty m:val="p"/>
+              </m:rPr>
               <m:t>C</m:t>
             </m:r>
           </m:sub>
@@ -30129,6 +30939,9 @@
           </m:e>
           <m:sub>
             <m:r>
+              <m:rPr>
+                <m:sty m:val="p"/>
+              </m:rPr>
               <m:t>S</m:t>
             </m:r>
           </m:sub>
@@ -30225,6 +31038,9 @@
           </m:e>
           <m:sub>
             <m:r>
+              <m:rPr>
+                <m:sty m:val="p"/>
+              </m:rPr>
               <m:t>G</m:t>
             </m:r>
           </m:sub>
@@ -30278,6 +31094,9 @@
           </m:e>
           <m:sub>
             <m:r>
+              <m:rPr>
+                <m:sty m:val="p"/>
+              </m:rPr>
               <m:t>V</m:t>
             </m:r>
           </m:sub>
@@ -30338,6 +31157,9 @@
           </m:e>
           <m:sub>
             <m:r>
+              <m:rPr>
+                <m:sty m:val="p"/>
+              </m:rPr>
               <m:t>G</m:t>
             </m:r>
           </m:sub>
@@ -30428,6 +31250,9 @@
           </m:e>
           <m:sub>
             <m:r>
+              <m:rPr>
+                <m:sty m:val="p"/>
+              </m:rPr>
               <m:t>V</m:t>
             </m:r>
           </m:sub>
@@ -30505,6 +31330,9 @@
           </m:e>
           <m:sub>
             <m:r>
+              <m:rPr>
+                <m:sty m:val="p"/>
+              </m:rPr>
               <m:t>G</m:t>
             </m:r>
           </m:sub>
@@ -30564,6 +31392,9 @@
           </m:e>
           <m:sub>
             <m:r>
+              <m:rPr>
+                <m:sty m:val="p"/>
+              </m:rPr>
               <m:t>V</m:t>
             </m:r>
           </m:sub>
@@ -30645,6 +31476,9 @@
           </m:e>
           <m:sub>
             <m:r>
+              <m:rPr>
+                <m:sty m:val="p"/>
+              </m:rPr>
               <m:t>M</m:t>
             </m:r>
           </m:sub>
@@ -30669,6 +31503,9 @@
               <m:t>,</m:t>
             </m:r>
             <m:r>
+              <m:rPr>
+                <m:sty m:val="p"/>
+              </m:rPr>
               <m:t>M</m:t>
             </m:r>
           </m:sub>
@@ -30747,15 +31584,27 @@
           </m:e>
           <m:sub>
             <m:r>
+              <m:rPr>
+                <m:sty m:val="p"/>
+              </m:rPr>
               <m:t>A</m:t>
             </m:r>
             <m:r>
+              <m:rPr>
+                <m:sty m:val="p"/>
+              </m:rPr>
               <m:t>M</m:t>
             </m:r>
             <m:r>
+              <m:rPr>
+                <m:sty m:val="p"/>
+              </m:rPr>
               <m:t>O</m:t>
             </m:r>
             <m:r>
+              <m:rPr>
+                <m:sty m:val="p"/>
+              </m:rPr>
               <m:t>C</m:t>
             </m:r>
           </m:sub>
@@ -30774,6 +31623,9 @@
           </m:e>
           <m:sub>
             <m:r>
+              <m:rPr>
+                <m:sty m:val="p"/>
+              </m:rPr>
               <m:t>S</m:t>
             </m:r>
           </m:sub>
@@ -30816,15 +31668,27 @@
           </m:e>
           <m:sub>
             <m:r>
+              <m:rPr>
+                <m:sty m:val="p"/>
+              </m:rPr>
               <m:t>A</m:t>
             </m:r>
             <m:r>
+              <m:rPr>
+                <m:sty m:val="p"/>
+              </m:rPr>
               <m:t>M</m:t>
             </m:r>
             <m:r>
+              <m:rPr>
+                <m:sty m:val="p"/>
+              </m:rPr>
               <m:t>O</m:t>
             </m:r>
             <m:r>
+              <m:rPr>
+                <m:sty m:val="p"/>
+              </m:rPr>
               <m:t>C</m:t>
             </m:r>
           </m:sub>
@@ -30914,6 +31778,9 @@
           </m:e>
           <m:sub>
             <m:r>
+              <m:rPr>
+                <m:sty m:val="p"/>
+              </m:rPr>
               <m:t>S</m:t>
             </m:r>
           </m:sub>
@@ -31608,6 +32475,9 @@
           </m:e>
           <m:sub>
             <m:r>
+              <m:rPr>
+                <m:sty m:val="p"/>
+              </m:rPr>
               <m:t>F</m:t>
             </m:r>
           </m:sub>
@@ -31673,9 +32543,15 @@
           </m:e>
           <m:sub>
             <m:r>
+              <m:rPr>
+                <m:sty m:val="p"/>
+              </m:rPr>
               <m:t>a</m:t>
             </m:r>
             <m:r>
+              <m:rPr>
+                <m:sty m:val="p"/>
+              </m:rPr>
               <m:t>b</m:t>
             </m:r>
           </m:sub>
@@ -31694,12 +32570,21 @@
           </m:e>
           <m:sub>
             <m:r>
+              <m:rPr>
+                <m:sty m:val="p"/>
+              </m:rPr>
               <m:t>e</m:t>
             </m:r>
             <m:r>
+              <m:rPr>
+                <m:sty m:val="p"/>
+              </m:rPr>
               <m:t>f</m:t>
             </m:r>
             <m:r>
+              <m:rPr>
+                <m:sty m:val="p"/>
+              </m:rPr>
               <m:t>f</m:t>
             </m:r>
           </m:sub>
@@ -31907,6 +32792,9 @@
                 </m:e>
                 <m:sub>
                   <m:r>
+                    <m:rPr>
+                      <m:sty m:val="p"/>
+                    </m:rPr>
                     <m:t>F</m:t>
                   </m:r>
                 </m:sub>
@@ -32000,6 +32888,9 @@
                 </m:e>
                 <m:sub>
                   <m:r>
+                    <m:rPr>
+                      <m:sty m:val="p"/>
+                    </m:rPr>
                     <m:t>M</m:t>
                   </m:r>
                 </m:sub>
@@ -32085,12 +32976,21 @@
                 </m:e>
                 <m:sub>
                   <m:r>
+                    <m:rPr>
+                      <m:sty m:val="p"/>
+                    </m:rPr>
                     <m:t>e</m:t>
                   </m:r>
                   <m:r>
+                    <m:rPr>
+                      <m:sty m:val="p"/>
+                    </m:rPr>
                     <m:t>f</m:t>
                   </m:r>
                   <m:r>
+                    <m:rPr>
+                      <m:sty m:val="p"/>
+                    </m:rPr>
                     <m:t>f</m:t>
                   </m:r>
                 </m:sub>
@@ -32215,6 +33115,9 @@
                     <m:t>,</m:t>
                   </m:r>
                   <m:r>
+                    <m:rPr>
+                      <m:sty m:val="p"/>
+                    </m:rPr>
                     <m:t>M</m:t>
                   </m:r>
                 </m:sub>
@@ -32416,6 +33319,9 @@
                 </m:e>
                 <m:sub>
                   <m:r>
+                    <m:rPr>
+                      <m:sty m:val="p"/>
+                    </m:rPr>
                     <m:t>M</m:t>
                   </m:r>
                 </m:sub>
@@ -32639,6 +33545,9 @@
                 </m:e>
                 <m:sub>
                   <m:r>
+                    <m:rPr>
+                      <m:sty m:val="p"/>
+                    </m:rPr>
                     <m:t>B</m:t>
                   </m:r>
                 </m:sub>
@@ -32694,6 +33603,9 @@
                 </m:e>
                 <m:sub>
                   <m:r>
+                    <m:rPr>
+                      <m:sty m:val="p"/>
+                    </m:rPr>
                     <m:t>e</m:t>
                   </m:r>
                 </m:sub>
@@ -32761,6 +33673,9 @@
                 </m:e>
                 <m:sub>
                   <m:r>
+                    <m:rPr>
+                      <m:sty m:val="p"/>
+                    </m:rPr>
                     <m:t>B</m:t>
                   </m:r>
                 </m:sub>
@@ -32773,6 +33688,9 @@
                 </m:e>
                 <m:sub>
                   <m:r>
+                    <m:rPr>
+                      <m:sty m:val="p"/>
+                    </m:rPr>
                     <m:t>B</m:t>
                   </m:r>
                 </m:sub>
@@ -33120,6 +34038,9 @@
           </m:e>
           <m:sub>
             <m:r>
+              <m:rPr>
+                <m:sty m:val="p"/>
+              </m:rPr>
               <m:t>M</m:t>
             </m:r>
           </m:sub>
@@ -33144,6 +34065,9 @@
               <m:t>,</m:t>
             </m:r>
             <m:r>
+              <m:rPr>
+                <m:sty m:val="p"/>
+              </m:rPr>
               <m:t>M</m:t>
             </m:r>
           </m:sub>
@@ -33275,6 +34199,9 @@
           </m:e>
           <m:sub>
             <m:r>
+              <m:rPr>
+                <m:sty m:val="p"/>
+              </m:rPr>
               <m:t>B</m:t>
             </m:r>
           </m:sub>
@@ -33398,6 +34325,9 @@
           </m:e>
           <m:sub>
             <m:r>
+              <m:rPr>
+                <m:sty m:val="p"/>
+              </m:rPr>
               <m:t>B</m:t>
             </m:r>
           </m:sub>
@@ -33514,6 +34444,9 @@
           </m:e>
           <m:sub>
             <m:r>
+              <m:rPr>
+                <m:sty m:val="p"/>
+              </m:rPr>
               <m:t>F</m:t>
             </m:r>
           </m:sub>
@@ -33532,12 +34465,21 @@
           </m:e>
           <m:sub>
             <m:r>
+              <m:rPr>
+                <m:sty m:val="p"/>
+              </m:rPr>
               <m:t>e</m:t>
             </m:r>
             <m:r>
+              <m:rPr>
+                <m:sty m:val="p"/>
+              </m:rPr>
               <m:t>f</m:t>
             </m:r>
             <m:r>
+              <m:rPr>
+                <m:sty m:val="p"/>
+              </m:rPr>
               <m:t>f</m:t>
             </m:r>
           </m:sub>
@@ -33694,6 +34636,9 @@
               </m:e>
               <m:sub>
                 <m:r>
+                  <m:rPr>
+                    <m:sty m:val="p"/>
+                  </m:rPr>
                   <m:t>F</m:t>
                 </m:r>
               </m:sub>
@@ -33708,12 +34653,21 @@
               </m:e>
               <m:sub>
                 <m:r>
+                  <m:rPr>
+                    <m:sty m:val="p"/>
+                  </m:rPr>
                   <m:t>e</m:t>
                 </m:r>
                 <m:r>
+                  <m:rPr>
+                    <m:sty m:val="p"/>
+                  </m:rPr>
                   <m:t>f</m:t>
                 </m:r>
                 <m:r>
+                  <m:rPr>
+                    <m:sty m:val="p"/>
+                  </m:rPr>
                   <m:t>f</m:t>
                 </m:r>
               </m:sub>
@@ -33814,12 +34768,21 @@
               </m:e>
               <m:sub>
                 <m:r>
+                  <m:rPr>
+                    <m:sty m:val="p"/>
+                  </m:rPr>
                   <m:t>e</m:t>
                 </m:r>
                 <m:r>
+                  <m:rPr>
+                    <m:sty m:val="p"/>
+                  </m:rPr>
                   <m:t>f</m:t>
                 </m:r>
                 <m:r>
+                  <m:rPr>
+                    <m:sty m:val="p"/>
+                  </m:rPr>
                   <m:t>f</m:t>
                 </m:r>
               </m:sub>
@@ -34112,6 +35075,9 @@
           </m:e>
           <m:sub>
             <m:r>
+              <m:rPr>
+                <m:sty m:val="p"/>
+              </m:rPr>
               <m:t>S</m:t>
             </m:r>
           </m:sub>
@@ -34136,6 +35102,9 @@
           </m:e>
           <m:sub>
             <m:r>
+              <m:rPr>
+                <m:sty m:val="p"/>
+              </m:rPr>
               <m:t>e</m:t>
             </m:r>
           </m:sub>
@@ -34164,6 +35133,9 @@
           </m:e>
           <m:sub>
             <m:r>
+              <m:rPr>
+                <m:sty m:val="p"/>
+              </m:rPr>
               <m:t>e</m:t>
             </m:r>
           </m:sub>
@@ -34233,6 +35205,9 @@
           </m:e>
           <m:sub>
             <m:r>
+              <m:rPr>
+                <m:sty m:val="p"/>
+              </m:rPr>
               <m:t>S</m:t>
             </m:r>
           </m:sub>
@@ -35162,6 +36137,9 @@
                 </m:e>
                 <m:sub>
                   <m:r>
+                    <m:rPr>
+                      <m:sty m:val="p"/>
+                    </m:rPr>
                     <m:t>P</m:t>
                   </m:r>
                 </m:sub>
@@ -35248,6 +36226,9 @@
                 </m:e>
                 <m:sub>
                   <m:r>
+                    <m:rPr>
+                      <m:sty m:val="p"/>
+                    </m:rPr>
                     <m:t>A</m:t>
                   </m:r>
                 </m:sub>
@@ -35345,6 +36326,9 @@
                 </m:e>
                 <m:sub>
                   <m:r>
+                    <m:rPr>
+                      <m:sty m:val="p"/>
+                    </m:rPr>
                     <m:t>W</m:t>
                   </m:r>
                 </m:sub>
@@ -35424,6 +36408,9 @@
                 </m:e>
                 <m:sub>
                   <m:r>
+                    <m:rPr>
+                      <m:sty m:val="p"/>
+                    </m:rPr>
                     <m:t>A</m:t>
                   </m:r>
                 </m:sub>
@@ -35529,6 +36516,9 @@
                 </m:e>
                 <m:sub>
                   <m:r>
+                    <m:rPr>
+                      <m:sty m:val="p"/>
+                    </m:rPr>
                     <m:t>R</m:t>
                   </m:r>
                 </m:sub>
@@ -35608,6 +36598,9 @@
                 </m:e>
                 <m:sub>
                   <m:r>
+                    <m:rPr>
+                      <m:sty m:val="p"/>
+                    </m:rPr>
                     <m:t>F</m:t>
                   </m:r>
                 </m:sub>
@@ -35690,9 +36683,15 @@
                 </m:e>
                 <m:sub>
                   <m:r>
+                    <m:rPr>
+                      <m:sty m:val="p"/>
+                    </m:rPr>
                     <m:t>F</m:t>
                   </m:r>
                   <m:r>
+                    <m:rPr>
+                      <m:sty m:val="p"/>
+                    </m:rPr>
                     <m:t>l</m:t>
                   </m:r>
                 </m:sub>
@@ -35763,6 +36762,9 @@
                 </m:e>
                 <m:sub>
                   <m:r>
+                    <m:rPr>
+                      <m:sty m:val="p"/>
+                    </m:rPr>
                     <m:t>B</m:t>
                   </m:r>
                 </m:sub>
@@ -35860,15 +36862,27 @@
                 </m:e>
                 <m:sub>
                   <m:r>
+                    <m:rPr>
+                      <m:sty m:val="p"/>
+                    </m:rPr>
                     <m:t>A</m:t>
                   </m:r>
                   <m:r>
+                    <m:rPr>
+                      <m:sty m:val="p"/>
+                    </m:rPr>
                     <m:t>M</m:t>
                   </m:r>
                   <m:r>
+                    <m:rPr>
+                      <m:sty m:val="p"/>
+                    </m:rPr>
                     <m:t>O</m:t>
                   </m:r>
                   <m:r>
+                    <m:rPr>
+                      <m:sty m:val="p"/>
+                    </m:rPr>
                     <m:t>C</m:t>
                   </m:r>
                 </m:sub>
@@ -36101,6 +37115,9 @@
                 </m:e>
                 <m:sub>
                   <m:r>
+                    <m:rPr>
+                      <m:sty m:val="p"/>
+                    </m:rPr>
                     <m:t>W</m:t>
                   </m:r>
                 </m:sub>
@@ -36193,6 +37210,9 @@
                 </m:e>
                 <m:sub>
                   <m:r>
+                    <m:rPr>
+                      <m:sty m:val="p"/>
+                    </m:rPr>
                     <m:t>M</m:t>
                   </m:r>
                 </m:sub>
@@ -36268,6 +37288,9 @@
                     <m:t>,</m:t>
                   </m:r>
                   <m:r>
+                    <m:rPr>
+                      <m:sty m:val="p"/>
+                    </m:rPr>
                     <m:t>W</m:t>
                   </m:r>
                 </m:sub>
@@ -36387,6 +37410,9 @@
                 </m:e>
                 <m:sub>
                   <m:r>
+                    <m:rPr>
+                      <m:sty m:val="p"/>
+                    </m:rPr>
                     <m:t>v</m:t>
                   </m:r>
                 </m:sub>
@@ -36711,6 +37737,9 @@
           </m:e>
           <m:sub>
             <m:r>
+              <m:rPr>
+                <m:sty m:val="p"/>
+              </m:rPr>
               <m:t>A</m:t>
             </m:r>
           </m:sub>
@@ -36736,6 +37765,9 @@
           </m:e>
           <m:sub>
             <m:r>
+              <m:rPr>
+                <m:sty m:val="p"/>
+              </m:rPr>
               <m:t>R</m:t>
             </m:r>
           </m:sub>
@@ -36775,15 +37807,27 @@
           </m:e>
           <m:sub>
             <m:r>
+              <m:rPr>
+                <m:sty m:val="p"/>
+              </m:rPr>
               <m:t>A</m:t>
             </m:r>
             <m:r>
+              <m:rPr>
+                <m:sty m:val="p"/>
+              </m:rPr>
               <m:t>M</m:t>
             </m:r>
             <m:r>
+              <m:rPr>
+                <m:sty m:val="p"/>
+              </m:rPr>
               <m:t>O</m:t>
             </m:r>
             <m:r>
+              <m:rPr>
+                <m:sty m:val="p"/>
+              </m:rPr>
               <m:t>C</m:t>
             </m:r>
           </m:sub>
@@ -36809,6 +37853,9 @@
           </m:e>
           <m:sub>
             <m:r>
+              <m:rPr>
+                <m:sty m:val="p"/>
+              </m:rPr>
               <m:t>A</m:t>
             </m:r>
           </m:sub>
@@ -36862,6 +37909,9 @@
           </m:e>
           <m:sub>
             <m:r>
+              <m:rPr>
+                <m:sty m:val="p"/>
+              </m:rPr>
               <m:t>A</m:t>
             </m:r>
           </m:sub>
@@ -36892,6 +37942,9 @@
           </m:e>
           <m:sub>
             <m:r>
+              <m:rPr>
+                <m:sty m:val="p"/>
+              </m:rPr>
               <m:t>A</m:t>
             </m:r>
           </m:sub>
@@ -37130,6 +38183,9 @@
           </m:e>
           <m:sub>
             <m:r>
+              <m:rPr>
+                <m:sty m:val="p"/>
+              </m:rPr>
               <m:t>N</m:t>
             </m:r>
           </m:sub>
@@ -37193,6 +38249,9 @@
           </m:e>
           <m:sub>
             <m:r>
+              <m:rPr>
+                <m:sty m:val="p"/>
+              </m:rPr>
               <m:t>V</m:t>
             </m:r>
           </m:sub>
@@ -37322,6 +38381,9 @@
           </m:e>
           <m:sub>
             <m:r>
+              <m:rPr>
+                <m:sty m:val="p"/>
+              </m:rPr>
               <m:t>V</m:t>
             </m:r>
           </m:sub>
@@ -37394,6 +38456,9 @@
           </m:e>
           <m:sub>
             <m:r>
+              <m:rPr>
+                <m:sty m:val="p"/>
+              </m:rPr>
               <m:t>V</m:t>
             </m:r>
           </m:sub>
@@ -37476,6 +38541,9 @@
           </m:e>
           <m:sub>
             <m:r>
+              <m:rPr>
+                <m:sty m:val="p"/>
+              </m:rPr>
               <m:t>V</m:t>
             </m:r>
           </m:sub>
@@ -37541,6 +38609,9 @@
           </m:e>
           <m:sub>
             <m:r>
+              <m:rPr>
+                <m:sty m:val="p"/>
+              </m:rPr>
               <m:t>V</m:t>
             </m:r>
           </m:sub>
@@ -37566,6 +38637,9 @@
           </m:e>
           <m:sub>
             <m:r>
+              <m:rPr>
+                <m:sty m:val="p"/>
+              </m:rPr>
               <m:t>M</m:t>
             </m:r>
           </m:sub>
@@ -37953,12 +39027,21 @@
           </m:e>
           <m:sub>
             <m:r>
+              <m:rPr>
+                <m:sty m:val="p"/>
+              </m:rPr>
               <m:t>e</m:t>
             </m:r>
             <m:r>
+              <m:rPr>
+                <m:sty m:val="p"/>
+              </m:rPr>
               <m:t>i</m:t>
             </m:r>
             <m:r>
+              <m:rPr>
+                <m:sty m:val="p"/>
+              </m:rPr>
               <m:t>n</m:t>
             </m:r>
           </m:sub>
@@ -38006,12 +39089,21 @@
           </m:e>
           <m:sub>
             <m:r>
+              <m:rPr>
+                <m:sty m:val="p"/>
+              </m:rPr>
               <m:t>a</m:t>
             </m:r>
             <m:r>
+              <m:rPr>
+                <m:sty m:val="p"/>
+              </m:rPr>
               <m:t>u</m:t>
             </m:r>
             <m:r>
+              <m:rPr>
+                <m:sty m:val="p"/>
+              </m:rPr>
               <m:t>s</m:t>
             </m:r>
           </m:sub>
@@ -38157,6 +39249,9 @@
           </m:e>
           <m:sub>
             <m:r>
+              <m:rPr>
+                <m:sty m:val="p"/>
+              </m:rPr>
               <m:t>T</m:t>
             </m:r>
           </m:sub>
@@ -38281,6 +39376,9 @@
           </m:e>
           <m:sub>
             <m:r>
+              <m:rPr>
+                <m:sty m:val="p"/>
+              </m:rPr>
               <m:t>E</m:t>
             </m:r>
           </m:sub>
@@ -38352,6 +39450,9 @@
           </m:e>
           <m:sub>
             <m:r>
+              <m:rPr>
+                <m:sty m:val="p"/>
+              </m:rPr>
               <m:t>s</m:t>
             </m:r>
           </m:sub>
@@ -38434,6 +39535,9 @@
           </m:e>
           <m:sub>
             <m:r>
+              <m:rPr>
+                <m:sty m:val="p"/>
+              </m:rPr>
               <m:t>E</m:t>
             </m:r>
           </m:sub>
@@ -39583,6 +40687,9 @@
           </m:e>
           <m:sub>
             <m:r>
+              <m:rPr>
+                <m:sty m:val="p"/>
+              </m:rPr>
               <m:t>O</m:t>
             </m:r>
           </m:sub>
@@ -39843,6 +40950,9 @@
                 </m:e>
                 <m:sub>
                   <m:r>
+                    <m:rPr>
+                      <m:sty m:val="p"/>
+                    </m:rPr>
                     <m:t>O</m:t>
                   </m:r>
                 </m:sub>
@@ -40005,6 +41115,9 @@
                 </m:e>
                 <m:sub>
                   <m:r>
+                    <m:rPr>
+                      <m:sty m:val="p"/>
+                    </m:rPr>
                     <m:t>O</m:t>
                   </m:r>
                 </m:sub>
@@ -40102,9 +41215,15 @@
                 </m:e>
                 <m:sub>
                   <m:r>
+                    <m:rPr>
+                      <m:sty m:val="p"/>
+                    </m:rPr>
                     <m:t>K</m:t>
                   </m:r>
                   <m:r>
+                    <m:rPr>
+                      <m:sty m:val="p"/>
+                    </m:rPr>
                     <m:t>V</m:t>
                   </m:r>
                 </m:sub>
@@ -40322,9 +41441,15 @@
                 </m:e>
                 <m:sub>
                   <m:r>
+                    <m:rPr>
+                      <m:sty m:val="p"/>
+                    </m:rPr>
                     <m:t>K</m:t>
                   </m:r>
                   <m:r>
+                    <m:rPr>
+                      <m:sty m:val="p"/>
+                    </m:rPr>
                     <m:t>V</m:t>
                   </m:r>
                   <m:r>
@@ -40334,6 +41459,9 @@
                     <m:t>,</m:t>
                   </m:r>
                   <m:r>
+                    <m:rPr>
+                      <m:sty m:val="p"/>
+                    </m:rPr>
                     <m:t>G</m:t>
                   </m:r>
                 </m:sub>
@@ -40428,6 +41556,9 @@
                 </m:e>
                 <m:sub>
                   <m:r>
+                    <m:rPr>
+                      <m:sty m:val="p"/>
+                    </m:rPr>
                     <m:t>B</m:t>
                   </m:r>
                 </m:sub>
@@ -40517,6 +41648,9 @@
                 </m:e>
                 <m:sub>
                   <m:r>
+                    <m:rPr>
+                      <m:sty m:val="p"/>
+                    </m:rPr>
                     <m:t>B</m:t>
                   </m:r>
                 </m:sub>
@@ -40741,9 +41875,15 @@
               </m:e>
               <m:sub>
                 <m:r>
+                  <m:rPr>
+                    <m:sty m:val="p"/>
+                  </m:rPr>
                   <m:t>K</m:t>
                 </m:r>
                 <m:r>
+                  <m:rPr>
+                    <m:sty m:val="p"/>
+                  </m:rPr>
                   <m:t>V</m:t>
                 </m:r>
               </m:sub>
@@ -40854,6 +41994,9 @@
           </m:e>
           <m:sub>
             <m:r>
+              <m:rPr>
+                <m:sty m:val="p"/>
+              </m:rPr>
               <m:t>O</m:t>
             </m:r>
           </m:sub>
@@ -40944,6 +42087,9 @@
               </m:e>
               <m:sub>
                 <m:r>
+                  <m:rPr>
+                    <m:sty m:val="p"/>
+                  </m:rPr>
                   <m:t>O</m:t>
                 </m:r>
               </m:sub>
@@ -41001,6 +42147,9 @@
           </m:e>
           <m:sub>
             <m:r>
+              <m:rPr>
+                <m:sty m:val="p"/>
+              </m:rPr>
               <m:t>O</m:t>
             </m:r>
           </m:sub>
@@ -41031,6 +42180,9 @@
               </m:e>
               <m:sub>
                 <m:r>
+                  <m:rPr>
+                    <m:sty m:val="p"/>
+                  </m:rPr>
                   <m:t>O</m:t>
                 </m:r>
               </m:sub>
@@ -41074,9 +42226,15 @@
               </m:e>
               <m:sub>
                 <m:r>
+                  <m:rPr>
+                    <m:sty m:val="p"/>
+                  </m:rPr>
                   <m:t>K</m:t>
                 </m:r>
                 <m:r>
+                  <m:rPr>
+                    <m:sty m:val="p"/>
+                  </m:rPr>
                   <m:t>V</m:t>
                 </m:r>
               </m:sub>
@@ -41134,9 +42292,15 @@
           </m:e>
           <m:sub>
             <m:r>
+              <m:rPr>
+                <m:sty m:val="p"/>
+              </m:rPr>
               <m:t>K</m:t>
             </m:r>
             <m:r>
+              <m:rPr>
+                <m:sty m:val="p"/>
+              </m:rPr>
               <m:t>V</m:t>
             </m:r>
           </m:sub>
@@ -41173,6 +42337,9 @@
           </m:e>
           <m:sub>
             <m:r>
+              <m:rPr>
+                <m:sty m:val="p"/>
+              </m:rPr>
               <m:t>O</m:t>
             </m:r>
           </m:sub>
@@ -41600,6 +42767,9 @@
           </m:e>
           <m:sub>
             <m:r>
+              <m:rPr>
+                <m:sty m:val="p"/>
+              </m:rPr>
               <m:t>B</m:t>
             </m:r>
           </m:sub>
@@ -41620,6 +42790,9 @@
           </m:e>
           <m:sub>
             <m:r>
+              <m:rPr>
+                <m:sty m:val="p"/>
+              </m:rPr>
               <m:t>B</m:t>
             </m:r>
           </m:sub>
@@ -41654,6 +42827,9 @@
               </m:e>
               <m:sub>
                 <m:r>
+                  <m:rPr>
+                    <m:sty m:val="p"/>
+                  </m:rPr>
                   <m:t>B</m:t>
                 </m:r>
               </m:sub>
@@ -41715,6 +42891,9 @@
           </m:e>
           <m:sub>
             <m:r>
+              <m:rPr>
+                <m:sty m:val="p"/>
+              </m:rPr>
               <m:t>M</m:t>
             </m:r>
           </m:sub>
@@ -41742,6 +42921,9 @@
           </m:e>
           <m:sub>
             <m:r>
+              <m:rPr>
+                <m:sty m:val="p"/>
+              </m:rPr>
               <m:t>M</m:t>
             </m:r>
           </m:sub>
@@ -41822,9 +43004,15 @@
           </m:e>
           <m:sub>
             <m:r>
+              <m:rPr>
+                <m:sty m:val="p"/>
+              </m:rPr>
               <m:t>K</m:t>
             </m:r>
             <m:r>
+              <m:rPr>
+                <m:sty m:val="p"/>
+              </m:rPr>
               <m:t>V</m:t>
             </m:r>
             <m:r>
@@ -41834,6 +43022,9 @@
               <m:t>,</m:t>
             </m:r>
             <m:r>
+              <m:rPr>
+                <m:sty m:val="p"/>
+              </m:rPr>
               <m:t>G</m:t>
             </m:r>
           </m:sub>
@@ -41854,12 +43045,21 @@
           </m:e>
           <m:sub>
             <m:r>
+              <m:rPr>
+                <m:sty m:val="p"/>
+              </m:rPr>
               <m:t>m</m:t>
             </m:r>
             <m:r>
+              <m:rPr>
+                <m:sty m:val="p"/>
+              </m:rPr>
               <m:t>a</m:t>
             </m:r>
             <m:r>
+              <m:rPr>
+                <m:sty m:val="p"/>
+              </m:rPr>
               <m:t>x</m:t>
             </m:r>
           </m:sub>
@@ -41914,6 +43114,9 @@
           </m:e>
           <m:sub>
             <m:r>
+              <m:rPr>
+                <m:sty m:val="p"/>
+              </m:rPr>
               <m:t>M</m:t>
             </m:r>
           </m:sub>
@@ -42254,6 +43457,9 @@
                 </m:e>
                 <m:sub>
                   <m:r>
+                    <m:rPr>
+                      <m:sty m:val="p"/>
+                    </m:rPr>
                     <m:t>K</m:t>
                   </m:r>
                 </m:sub>
@@ -42386,6 +43592,9 @@
                 </m:e>
                 <m:sub>
                   <m:r>
+                    <m:rPr>
+                      <m:sty m:val="p"/>
+                    </m:rPr>
                     <m:t>S</m:t>
                   </m:r>
                 </m:sub>
@@ -42740,9 +43949,15 @@
               </m:e>
               <m:sub>
                 <m:r>
+                  <m:rPr>
+                    <m:sty m:val="p"/>
+                  </m:rPr>
                   <m:t>K</m:t>
                 </m:r>
                 <m:r>
+                  <m:rPr>
+                    <m:sty m:val="p"/>
+                  </m:rPr>
                   <m:t>V</m:t>
                 </m:r>
               </m:sub>
@@ -42815,6 +44030,9 @@
           </m:e>
           <m:sub>
             <m:r>
+              <m:rPr>
+                <m:sty m:val="p"/>
+              </m:rPr>
               <m:t>O</m:t>
             </m:r>
           </m:sub>
@@ -42845,9 +44063,15 @@
               </m:e>
               <m:sub>
                 <m:r>
+                  <m:rPr>
+                    <m:sty m:val="p"/>
+                  </m:rPr>
                   <m:t>K</m:t>
                 </m:r>
                 <m:r>
+                  <m:rPr>
+                    <m:sty m:val="p"/>
+                  </m:rPr>
                   <m:t>V</m:t>
                 </m:r>
               </m:sub>
@@ -42936,9 +44160,15 @@
           </m:e>
           <m:sub>
             <m:r>
+              <m:rPr>
+                <m:sty m:val="p"/>
+              </m:rPr>
               <m:t>K</m:t>
             </m:r>
             <m:r>
+              <m:rPr>
+                <m:sty m:val="p"/>
+              </m:rPr>
               <m:t>V</m:t>
             </m:r>
           </m:sub>
@@ -43063,9 +44293,15 @@
           </m:e>
           <m:sub>
             <m:r>
+              <m:rPr>
+                <m:sty m:val="p"/>
+              </m:rPr>
               <m:t>K</m:t>
             </m:r>
             <m:r>
+              <m:rPr>
+                <m:sty m:val="p"/>
+              </m:rPr>
               <m:t>V</m:t>
             </m:r>
           </m:sub>
@@ -43246,6 +44482,9 @@
           </m:e>
           <m:sub>
             <m:r>
+              <m:rPr>
+                <m:sty m:val="p"/>
+              </m:rPr>
               <m:t>O</m:t>
             </m:r>
           </m:sub>
@@ -43276,6 +44515,9 @@
           </m:e>
           <m:sub>
             <m:r>
+              <m:rPr>
+                <m:sty m:val="p"/>
+              </m:rPr>
               <m:t>O</m:t>
             </m:r>
           </m:sub>
@@ -43361,6 +44603,9 @@
           </m:e>
           <m:sub>
             <m:r>
+              <m:rPr>
+                <m:sty m:val="p"/>
+              </m:rPr>
               <m:t>K</m:t>
             </m:r>
           </m:sub>
@@ -43402,6 +44647,9 @@
           </m:e>
           <m:sub>
             <m:r>
+              <m:rPr>
+                <m:sty m:val="p"/>
+              </m:rPr>
               <m:t>O</m:t>
             </m:r>
           </m:sub>
@@ -43432,6 +44680,9 @@
           </m:e>
           <m:sub>
             <m:r>
+              <m:rPr>
+                <m:sty m:val="p"/>
+              </m:rPr>
               <m:t>S</m:t>
             </m:r>
           </m:sub>
@@ -43459,6 +44710,9 @@
           </m:e>
           <m:sub>
             <m:r>
+              <m:rPr>
+                <m:sty m:val="p"/>
+              </m:rPr>
               <m:t>S</m:t>
             </m:r>
           </m:sub>
@@ -43484,6 +44738,9 @@
           </m:e>
           <m:sub>
             <m:r>
+              <m:rPr>
+                <m:sty m:val="p"/>
+              </m:rPr>
               <m:t>O</m:t>
             </m:r>
           </m:sub>
@@ -43709,6 +44966,9 @@
           </m:e>
           <m:sub>
             <m:r>
+              <m:rPr>
+                <m:sty m:val="p"/>
+              </m:rPr>
               <m:t>O</m:t>
             </m:r>
           </m:sub>
@@ -44182,9 +45442,15 @@
             </m:e>
             <m:sub>
               <m:r>
+                <m:rPr>
+                  <m:sty m:val="p"/>
+                </m:rPr>
                 <m:t>K</m:t>
               </m:r>
               <m:r>
+                <m:rPr>
+                  <m:sty m:val="p"/>
+                </m:rPr>
                 <m:t>V</m:t>
               </m:r>
             </m:sub>
@@ -45900,6 +47166,9 @@
                 </m:e>
                 <m:sub>
                   <m:r>
+                    <m:rPr>
+                      <m:sty m:val="p"/>
+                    </m:rPr>
                     <m:t>G</m:t>
                   </m:r>
                 </m:sub>
@@ -46003,6 +47272,9 @@
                 </m:e>
                 <m:sub>
                   <m:r>
+                    <m:rPr>
+                      <m:sty m:val="p"/>
+                    </m:rPr>
                     <m:t>m</m:t>
                   </m:r>
                   <m:r>
@@ -46012,6 +47284,9 @@
                     <m:t>,</m:t>
                   </m:r>
                   <m:r>
+                    <m:rPr>
+                      <m:sty m:val="p"/>
+                    </m:rPr>
                     <m:t>P</m:t>
                   </m:r>
                 </m:sub>
@@ -46114,6 +47389,9 @@
                     <m:t>,</m:t>
                   </m:r>
                   <m:r>
+                    <m:rPr>
+                      <m:sty m:val="p"/>
+                    </m:rPr>
                     <m:t>P</m:t>
                   </m:r>
                 </m:sub>
@@ -46191,6 +47469,9 @@
                 </m:e>
                 <m:sub>
                   <m:r>
+                    <m:rPr>
+                      <m:sty m:val="p"/>
+                    </m:rPr>
                     <m:t>P</m:t>
                   </m:r>
                 </m:sub>
@@ -46268,6 +47549,9 @@
           </m:e>
           <m:sub>
             <m:r>
+              <m:rPr>
+                <m:sty m:val="p"/>
+              </m:rPr>
               <m:t>m</m:t>
             </m:r>
           </m:sub>
@@ -46355,6 +47639,9 @@
           </m:e>
           <m:sub>
             <m:r>
+              <m:rPr>
+                <m:sty m:val="p"/>
+              </m:rPr>
               <m:t>P</m:t>
             </m:r>
           </m:sub>
@@ -46378,6 +47665,9 @@
           </m:e>
           <m:sub>
             <m:r>
+              <m:rPr>
+                <m:sty m:val="p"/>
+              </m:rPr>
               <m:t>P</m:t>
             </m:r>
           </m:sub>
@@ -46401,6 +47691,9 @@
           </m:e>
           <m:sub>
             <m:r>
+              <m:rPr>
+                <m:sty m:val="p"/>
+              </m:rPr>
               <m:t>J</m:t>
             </m:r>
           </m:sub>
@@ -46466,6 +47759,9 @@
           </m:e>
           <m:sub>
             <m:r>
+              <m:rPr>
+                <m:sty m:val="p"/>
+              </m:rPr>
               <m:t>T</m:t>
             </m:r>
           </m:sub>
@@ -46541,6 +47837,9 @@
             </m:e>
             <m:sub>
               <m:r>
+                <m:rPr>
+                  <m:sty m:val="p"/>
+                </m:rPr>
                 <m:t>m</m:t>
               </m:r>
             </m:sub>
@@ -47212,6 +48511,9 @@
           </m:e>
           <m:sub>
             <m:r>
+              <m:rPr>
+                <m:sty m:val="p"/>
+              </m:rPr>
               <m:t>T</m:t>
             </m:r>
           </m:sub>
@@ -47298,6 +48600,9 @@
           </m:e>
           <m:sub>
             <m:r>
+              <m:rPr>
+                <m:sty m:val="p"/>
+              </m:rPr>
               <m:t>T</m:t>
             </m:r>
           </m:sub>
@@ -47348,6 +48653,9 @@
           </m:e>
           <m:sub>
             <m:r>
+              <m:rPr>
+                <m:sty m:val="p"/>
+              </m:rPr>
               <m:t>J</m:t>
             </m:r>
           </m:sub>
@@ -47434,6 +48742,9 @@
           </m:e>
           <m:sub>
             <m:r>
+              <m:rPr>
+                <m:sty m:val="p"/>
+              </m:rPr>
               <m:t>J</m:t>
             </m:r>
           </m:sub>
@@ -47816,6 +49127,9 @@
           </m:e>
           <m:sub>
             <m:r>
+              <m:rPr>
+                <m:sty m:val="p"/>
+              </m:rPr>
               <m:t>K</m:t>
             </m:r>
           </m:sub>
@@ -47893,6 +49207,9 @@
               </m:e>
               <m:sub>
                 <m:r>
+                  <m:rPr>
+                    <m:sty m:val="p"/>
+                  </m:rPr>
                   <m:t>K</m:t>
                 </m:r>
               </m:sub>
@@ -47970,6 +49287,9 @@
           </m:e>
           <m:sub>
             <m:r>
+              <m:rPr>
+                <m:sty m:val="p"/>
+              </m:rPr>
               <m:t>m</m:t>
             </m:r>
             <m:r>
@@ -47979,6 +49299,9 @@
               <m:t>,</m:t>
             </m:r>
             <m:r>
+              <m:rPr>
+                <m:sty m:val="p"/>
+              </m:rPr>
               <m:t>P</m:t>
             </m:r>
           </m:sub>
@@ -48005,6 +49328,9 @@
           </m:e>
           <m:sub>
             <m:r>
+              <m:rPr>
+                <m:sty m:val="p"/>
+              </m:rPr>
               <m:t>P</m:t>
             </m:r>
           </m:sub>
@@ -48206,6 +49532,9 @@
           </m:e>
           <m:sub>
             <m:r>
+              <m:rPr>
+                <m:sty m:val="p"/>
+              </m:rPr>
               <m:t>E</m:t>
             </m:r>
           </m:sub>
@@ -48286,6 +49615,9 @@
               </m:e>
               <m:sub>
                 <m:r>
+                  <m:rPr>
+                    <m:sty m:val="p"/>
+                  </m:rPr>
                   <m:t>G</m:t>
                 </m:r>
               </m:sub>
@@ -48301,6 +49633,9 @@
               </m:e>
               <m:sub>
                 <m:r>
+                  <m:rPr>
+                    <m:sty m:val="p"/>
+                  </m:rPr>
                   <m:t>E</m:t>
                 </m:r>
               </m:sub>
@@ -48379,6 +49714,9 @@
           </m:e>
           <m:sub>
             <m:r>
+              <m:rPr>
+                <m:sty m:val="p"/>
+              </m:rPr>
               <m:t>A</m:t>
             </m:r>
           </m:sub>
@@ -48423,6 +49761,9 @@
           </m:e>
           <m:sub>
             <m:r>
+              <m:rPr>
+                <m:sty m:val="p"/>
+              </m:rPr>
               <m:t>O</m:t>
             </m:r>
           </m:sub>
@@ -48542,6 +49883,9 @@
                 </m:e>
                 <m:sub>
                   <m:r>
+                    <m:rPr>
+                      <m:sty m:val="p"/>
+                    </m:rPr>
                     <m:t>A</m:t>
                   </m:r>
                 </m:sub>
@@ -48560,6 +49904,9 @@
                 </m:e>
                 <m:sub>
                   <m:r>
+                    <m:rPr>
+                      <m:sty m:val="p"/>
+                    </m:rPr>
                     <m:t>O</m:t>
                   </m:r>
                 </m:sub>
@@ -60424,6 +61771,9 @@
           </m:e>
           <m:sub>
             <m:r>
+              <m:rPr>
+                <m:sty m:val="p"/>
+              </m:rPr>
               <m:t>E</m:t>
             </m:r>
           </m:sub>
@@ -60471,6 +61821,9 @@
           </m:e>
           <m:sub>
             <m:r>
+              <m:rPr>
+                <m:sty m:val="p"/>
+              </m:rPr>
               <m:t>S</m:t>
             </m:r>
           </m:sub>
@@ -60560,6 +61913,9 @@
           </m:e>
           <m:sub>
             <m:r>
+              <m:rPr>
+                <m:sty m:val="p"/>
+              </m:rPr>
               <m:t>S</m:t>
             </m:r>
           </m:sub>
@@ -60852,6 +62208,9 @@
           </m:e>
           <m:sub>
             <m:r>
+              <m:rPr>
+                <m:sty m:val="p"/>
+              </m:rPr>
               <m:t>E</m:t>
             </m:r>
           </m:sub>
@@ -60933,6 +62292,9 @@
           </m:e>
           <m:sub>
             <m:r>
+              <m:rPr>
+                <m:sty m:val="p"/>
+              </m:rPr>
               <m:t>E</m:t>
             </m:r>
           </m:sub>
@@ -61004,15 +62366,27 @@
           </m:e>
           <m:sub>
             <m:r>
+              <m:rPr>
+                <m:sty m:val="p"/>
+              </m:rPr>
               <m:t>s</m:t>
             </m:r>
             <m:r>
+              <m:rPr>
+                <m:sty m:val="p"/>
+              </m:rPr>
               <m:t>c</m:t>
             </m:r>
             <m:r>
+              <m:rPr>
+                <m:sty m:val="p"/>
+              </m:rPr>
               <m:t>h</m:t>
             </m:r>
             <m:r>
+              <m:rPr>
+                <m:sty m:val="p"/>
+              </m:rPr>
               <m:t>m</m:t>
             </m:r>
           </m:sub>
@@ -61084,6 +62458,9 @@
           </m:e>
           <m:sub>
             <m:r>
+              <m:rPr>
+                <m:sty m:val="p"/>
+              </m:rPr>
               <m:t>J</m:t>
             </m:r>
           </m:sub>
@@ -61190,6 +62567,9 @@
           </m:e>
           <m:sub>
             <m:r>
+              <m:rPr>
+                <m:sty m:val="p"/>
+              </m:rPr>
               <m:t>a</m:t>
             </m:r>
           </m:sub>
@@ -61463,9 +62843,15 @@
           </m:e>
           <m:sub>
             <m:r>
+              <m:rPr>
+                <m:sty m:val="p"/>
+              </m:rPr>
               <m:t>S</m:t>
             </m:r>
             <m:r>
+              <m:rPr>
+                <m:sty m:val="p"/>
+              </m:rPr>
               <m:t>t</m:t>
             </m:r>
           </m:sub>
@@ -61510,9 +62896,15 @@
           </m:e>
           <m:sub>
             <m:r>
+              <m:rPr>
+                <m:sty m:val="p"/>
+              </m:rPr>
               <m:t>S</m:t>
             </m:r>
             <m:r>
+              <m:rPr>
+                <m:sty m:val="p"/>
+              </m:rPr>
               <m:t>t</m:t>
             </m:r>
           </m:sub>
@@ -61563,12 +62955,21 @@
           </m:e>
           <m:sub>
             <m:r>
+              <m:rPr>
+                <m:sty m:val="p"/>
+              </m:rPr>
               <m:t>I</m:t>
             </m:r>
             <m:r>
+              <m:rPr>
+                <m:sty m:val="p"/>
+              </m:rPr>
               <m:t>s</m:t>
             </m:r>
             <m:r>
+              <m:rPr>
+                <m:sty m:val="p"/>
+              </m:rPr>
               <m:t>o</m:t>
             </m:r>
           </m:sub>
@@ -61622,6 +63023,9 @@
           </m:e>
           <m:sub>
             <m:r>
+              <m:rPr>
+                <m:sty m:val="p"/>
+              </m:rPr>
               <m:t>i</m:t>
             </m:r>
           </m:sub>
@@ -61782,6 +63186,9 @@
           </m:e>
           <m:sub>
             <m:r>
+              <m:rPr>
+                <m:sty m:val="p"/>
+              </m:rPr>
               <m:t>L</m:t>
             </m:r>
           </m:sub>
@@ -61802,6 +63209,9 @@
           </m:e>
           <m:sub>
             <m:r>
+              <m:rPr>
+                <m:sty m:val="p"/>
+              </m:rPr>
               <m:t>L</m:t>
             </m:r>
           </m:sub>
@@ -62011,9 +63421,15 @@
           </m:e>
           <m:sub>
             <m:r>
+              <m:rPr>
+                <m:sty m:val="p"/>
+              </m:rPr>
               <m:t>S</m:t>
             </m:r>
             <m:r>
+              <m:rPr>
+                <m:sty m:val="p"/>
+              </m:rPr>
               <m:t>t</m:t>
             </m:r>
           </m:sub>
@@ -62086,12 +63502,21 @@
           </m:e>
           <m:sub>
             <m:r>
+              <m:rPr>
+                <m:sty m:val="p"/>
+              </m:rPr>
               <m:t>I</m:t>
             </m:r>
             <m:r>
+              <m:rPr>
+                <m:sty m:val="p"/>
+              </m:rPr>
               <m:t>s</m:t>
             </m:r>
             <m:r>
+              <m:rPr>
+                <m:sty m:val="p"/>
+              </m:rPr>
               <m:t>o</m:t>
             </m:r>
           </m:sub>
@@ -62176,6 +63601,9 @@
           </m:e>
           <m:sub>
             <m:r>
+              <m:rPr>
+                <m:sty m:val="p"/>
+              </m:rPr>
               <m:t>i</m:t>
             </m:r>
           </m:sub>
@@ -62338,6 +63766,9 @@
           </m:e>
           <m:sub>
             <m:r>
+              <m:rPr>
+                <m:sty m:val="p"/>
+              </m:rPr>
               <m:t>i</m:t>
             </m:r>
           </m:sub>
@@ -62361,6 +63792,9 @@
           </m:e>
           <m:sub>
             <m:r>
+              <m:rPr>
+                <m:sty m:val="p"/>
+              </m:rPr>
               <m:t>a</m:t>
             </m:r>
           </m:sub>
@@ -62583,6 +64017,9 @@
           </m:e>
           <m:sub>
             <m:r>
+              <m:rPr>
+                <m:sty m:val="p"/>
+              </m:rPr>
               <m:t>p</m:t>
             </m:r>
           </m:sub>
@@ -62663,6 +64100,9 @@
           </m:e>
           <m:sub>
             <m:r>
+              <m:rPr>
+                <m:sty m:val="p"/>
+              </m:rPr>
               <m:t>O</m:t>
             </m:r>
           </m:sub>
@@ -62753,6 +64193,9 @@
           </m:e>
           <m:sub>
             <m:r>
+              <m:rPr>
+                <m:sty m:val="p"/>
+              </m:rPr>
               <m:t>E</m:t>
             </m:r>
           </m:sub>
@@ -63194,6 +64637,9 @@
           </m:e>
           <m:sub>
             <m:r>
+              <m:rPr>
+                <m:sty m:val="p"/>
+              </m:rPr>
               <m:t>e</m:t>
             </m:r>
           </m:sub>
@@ -63622,6 +65068,9 @@
           </m:e>
           <m:sub>
             <m:r>
+              <m:rPr>
+                <m:sty m:val="p"/>
+              </m:rPr>
               <m:t>L</m:t>
             </m:r>
           </m:sub>
@@ -63936,6 +65385,9 @@
           </m:e>
           <m:sub>
             <m:r>
+              <m:rPr>
+                <m:sty m:val="p"/>
+              </m:rPr>
               <m:t>L</m:t>
             </m:r>
           </m:sub>

</xml_diff>